<commit_message>
fix(manual): recapture 1600x960 screenshots with tight accurate annotations
Recaptured all 27 screenshots at 1600x960 desktop resolution using targeted CSS selectors and single-session browser lifecycle management. Applied 100% transparent interior bounding boxes with 2px emerald outlines and top-left anchored numbered badges. Recompiled DOCX and PDF user manuals with 1:1 callout alignment.
</commit_message>
<xml_diff>
--- a/docs/user_manual/output/Cabanatuan_City_Ordinance_Portal_User_Manual.docx
+++ b/docs/user_manual/output/Cabanatuan_City_Ordinance_Portal_User_Manual.docx
@@ -2668,7 +2668,7 @@
       <w:r>
         <w:drawing>
           <wp:inline xmlns:a="http://schemas.openxmlformats.org/drawingml/2006/main" xmlns:pic="http://schemas.openxmlformats.org/drawingml/2006/picture">
-            <wp:extent cx="5715000" cy="3571875"/>
+            <wp:extent cx="5715000" cy="3429000"/>
             <wp:docPr id="2" name="Picture 2"/>
             <wp:cNvGraphicFramePr>
               <a:graphicFrameLocks noChangeAspect="1"/>
@@ -2689,7 +2689,7 @@
                   <pic:spPr>
                     <a:xfrm>
                       <a:off x="0" y="0"/>
-                      <a:ext cx="5715000" cy="3571875"/>
+                      <a:ext cx="5715000" cy="3429000"/>
                     </a:xfrm>
                     <a:prstGeom prst="rect"/>
                   </pic:spPr>
@@ -3036,7 +3036,7 @@
                 <w:color w:val="0F172A"/>
                 <w:sz w:val="19"/>
               </w:rPr>
-              <w:t>Hero Search Bar</w:t>
+              <w:t>Hero Ordinance Search Input</w:t>
             </w:r>
           </w:p>
         </w:tc>
@@ -3116,7 +3116,7 @@
                 <w:color w:val="0F172A"/>
                 <w:sz w:val="19"/>
               </w:rPr>
-              <w:t>Quick Category Discovery Chips</w:t>
+              <w:t>Search Submit Button</w:t>
             </w:r>
           </w:p>
         </w:tc>
@@ -3141,7 +3141,7 @@
                 <w:color w:val="334155"/>
                 <w:sz w:val="18"/>
               </w:rPr>
-              <w:t>Quick-discovery filter chips enabling 1-click access to common legal categories (#Basura, #Trapiko, #Kalusugan).</w:t>
+              <w:t>Search submission trigger initiating instant client-side filtering across approved city legislation.</w:t>
             </w:r>
           </w:p>
         </w:tc>
@@ -3196,7 +3196,7 @@
                 <w:color w:val="0F172A"/>
                 <w:sz w:val="19"/>
               </w:rPr>
-              <w:t>Interactive 3D Ordinance Archive Canvas</w:t>
+              <w:t>Ask AI Assistant Action Button</w:t>
             </w:r>
           </w:p>
         </w:tc>
@@ -3221,7 +3221,7 @@
                 <w:color w:val="334155"/>
                 <w:sz w:val="18"/>
               </w:rPr>
-              <w:t>Interactive WebGL Three.js 3D cylindrical visualization displaying active municipal legislation.</w:t>
+              <w:t>1-click shortcut launching the bilingual Cabanatuan Ordinance AI citizen conversational assistant.</w:t>
             </w:r>
           </w:p>
         </w:tc>
@@ -3276,7 +3276,7 @@
                 <w:color w:val="0F172A"/>
                 <w:sz w:val="19"/>
               </w:rPr>
-              <w:t>Portal Theme Toggle (Dark/Light)</w:t>
+              <w:t>Interactive 3D Ordinance Archive Canvas</w:t>
             </w:r>
           </w:p>
         </w:tc>
@@ -3284,6 +3284,86 @@
           <w:tcPr>
             <w:tcW w:type="dxa" w:w="5328"/>
             <w:shd w:fill="F8FAFC"/>
+            <w:tcMar>
+              <w:top w:w="80" w:type="dxa"/>
+              <w:bottom w:w="80" w:type="dxa"/>
+              <w:left w:w="120" w:type="dxa"/>
+              <w:right w:w="120" w:type="dxa"/>
+            </w:tcMar>
+          </w:tcPr>
+          <w:p>
+            <w:pPr>
+              <w:spacing w:before="0" w:after="0" w:line="276" w:lineRule="auto"/>
+            </w:pPr>
+            <w:r>
+              <w:rPr>
+                <w:rFonts w:ascii="Arial" w:hAnsi="Arial"/>
+                <w:color w:val="334155"/>
+                <w:sz w:val="18"/>
+              </w:rPr>
+              <w:t>Interactive WebGL Three.js 3D cylindrical visualization displaying active municipal legislation.</w:t>
+            </w:r>
+          </w:p>
+        </w:tc>
+      </w:tr>
+      <w:tr>
+        <w:tc>
+          <w:tcPr>
+            <w:tcW w:type="dxa" w:w="864"/>
+            <w:shd w:fill="FFFFFF"/>
+            <w:tcMar>
+              <w:top w:w="80" w:type="dxa"/>
+              <w:bottom w:w="80" w:type="dxa"/>
+              <w:left w:w="120" w:type="dxa"/>
+              <w:right w:w="120" w:type="dxa"/>
+            </w:tcMar>
+          </w:tcPr>
+          <w:p>
+            <w:pPr>
+              <w:spacing w:before="0" w:after="0"/>
+              <w:jc w:val="center"/>
+            </w:pPr>
+            <w:r>
+              <w:rPr>
+                <w:rFonts w:ascii="Arial" w:hAnsi="Arial"/>
+                <w:b/>
+                <w:color w:val="047857"/>
+                <w:sz w:val="19"/>
+              </w:rPr>
+              <w:t>7</w:t>
+            </w:r>
+          </w:p>
+        </w:tc>
+        <w:tc>
+          <w:tcPr>
+            <w:tcW w:type="dxa" w:w="3168"/>
+            <w:shd w:fill="FFFFFF"/>
+            <w:tcMar>
+              <w:top w:w="80" w:type="dxa"/>
+              <w:bottom w:w="80" w:type="dxa"/>
+              <w:left w:w="120" w:type="dxa"/>
+              <w:right w:w="120" w:type="dxa"/>
+            </w:tcMar>
+          </w:tcPr>
+          <w:p>
+            <w:pPr>
+              <w:spacing w:before="0" w:after="0"/>
+            </w:pPr>
+            <w:r>
+              <w:rPr>
+                <w:rFonts w:ascii="Arial" w:hAnsi="Arial"/>
+                <w:b/>
+                <w:color w:val="0F172A"/>
+                <w:sz w:val="19"/>
+              </w:rPr>
+              <w:t>Portal Theme Toggle (Dark/Light)</w:t>
+            </w:r>
+          </w:p>
+        </w:tc>
+        <w:tc>
+          <w:tcPr>
+            <w:tcW w:type="dxa" w:w="5328"/>
+            <w:shd w:fill="FFFFFF"/>
             <w:tcMar>
               <w:top w:w="80" w:type="dxa"/>
               <w:bottom w:w="80" w:type="dxa"/>
@@ -3448,7 +3528,7 @@
       <w:r>
         <w:drawing>
           <wp:inline xmlns:a="http://schemas.openxmlformats.org/drawingml/2006/main" xmlns:pic="http://schemas.openxmlformats.org/drawingml/2006/picture">
-            <wp:extent cx="5715000" cy="3571875"/>
+            <wp:extent cx="5715000" cy="3429000"/>
             <wp:docPr id="3" name="Picture 3"/>
             <wp:cNvGraphicFramePr>
               <a:graphicFrameLocks noChangeAspect="1"/>
@@ -3469,7 +3549,7 @@
                   <pic:spPr>
                     <a:xfrm>
                       <a:off x="0" y="0"/>
-                      <a:ext cx="5715000" cy="3571875"/>
+                      <a:ext cx="5715000" cy="3429000"/>
                     </a:xfrm>
                     <a:prstGeom prst="rect"/>
                   </pic:spPr>
@@ -3896,7 +3976,7 @@
                 <w:color w:val="0F172A"/>
                 <w:sz w:val="19"/>
               </w:rPr>
-              <w:t>Sign In / Submit Button (Pumasok sa Portal)</w:t>
+              <w:t>Sign In / Submit Button</w:t>
             </w:r>
           </w:p>
         </w:tc>
@@ -4182,7 +4262,7 @@
       <w:r>
         <w:drawing>
           <wp:inline xmlns:a="http://schemas.openxmlformats.org/drawingml/2006/main" xmlns:pic="http://schemas.openxmlformats.org/drawingml/2006/picture">
-            <wp:extent cx="5715000" cy="3571875"/>
+            <wp:extent cx="5715000" cy="3429000"/>
             <wp:docPr id="4" name="Picture 4"/>
             <wp:cNvGraphicFramePr>
               <a:graphicFrameLocks noChangeAspect="1"/>
@@ -4203,7 +4283,7 @@
                   <pic:spPr>
                     <a:xfrm>
                       <a:off x="0" y="0"/>
-                      <a:ext cx="5715000" cy="3571875"/>
+                      <a:ext cx="5715000" cy="3429000"/>
                     </a:xfrm>
                     <a:prstGeom prst="rect"/>
                   </pic:spPr>
@@ -4550,7 +4630,7 @@
                 <w:color w:val="0F172A"/>
                 <w:sz w:val="19"/>
               </w:rPr>
-              <w:t>Dark Glassmorphic Search &amp; Suggestion Bar</w:t>
+              <w:t>Dark Glassmorphic Search Bar</w:t>
             </w:r>
           </w:p>
         </w:tc>
@@ -4920,7 +5000,7 @@
       <w:r>
         <w:drawing>
           <wp:inline xmlns:a="http://schemas.openxmlformats.org/drawingml/2006/main" xmlns:pic="http://schemas.openxmlformats.org/drawingml/2006/picture">
-            <wp:extent cx="5715000" cy="3571875"/>
+            <wp:extent cx="5715000" cy="3429000"/>
             <wp:docPr id="5" name="Picture 5"/>
             <wp:cNvGraphicFramePr>
               <a:graphicFrameLocks noChangeAspect="1"/>
@@ -4941,7 +5021,7 @@
                   <pic:spPr>
                     <a:xfrm>
                       <a:off x="0" y="0"/>
-                      <a:ext cx="5715000" cy="3571875"/>
+                      <a:ext cx="5715000" cy="3429000"/>
                     </a:xfrm>
                     <a:prstGeom prst="rect"/>
                   </pic:spPr>
@@ -5208,7 +5288,7 @@
                 <w:color w:val="0F172A"/>
                 <w:sz w:val="19"/>
               </w:rPr>
-              <w:t>Policy Category Filter Chips</w:t>
+              <w:t>Jurisdiction Scope Filter (Lahat, City, Barangay)</w:t>
             </w:r>
           </w:p>
         </w:tc>
@@ -5233,7 +5313,7 @@
                 <w:color w:val="334155"/>
                 <w:sz w:val="18"/>
               </w:rPr>
-              <w:t>Interactive category pill selectors filtering records by municipal jurisdiction areas.</w:t>
+              <w:t>Jurisdiction filter segmented buttons toggling between City-Wide and Barangay-level ordinances.</w:t>
             </w:r>
           </w:p>
         </w:tc>
@@ -5288,7 +5368,7 @@
                 <w:color w:val="0F172A"/>
                 <w:sz w:val="19"/>
               </w:rPr>
-              <w:t>Dynamic Year Range Filter Slider</w:t>
+              <w:t>Policy Category Filter Dropdown</w:t>
             </w:r>
           </w:p>
         </w:tc>
@@ -5313,7 +5393,7 @@
                 <w:color w:val="334155"/>
                 <w:sz w:val="18"/>
               </w:rPr>
-              <w:t>Dynamic double-ended year slider isolating ordinances enacted between 2018 and 2026.</w:t>
+              <w:t>Policy category selector dropdown filtering ordinances by municipal administrative domain.</w:t>
             </w:r>
           </w:p>
         </w:tc>
@@ -5368,7 +5448,7 @@
                 <w:color w:val="0F172A"/>
                 <w:sz w:val="19"/>
               </w:rPr>
-              <w:t>Jurisdiction Scope Filter (City vs Barangay)</w:t>
+              <w:t>Legislative Year Filter Dropdown</w:t>
             </w:r>
           </w:p>
         </w:tc>
@@ -5393,7 +5473,7 @@
                 <w:color w:val="334155"/>
                 <w:sz w:val="18"/>
               </w:rPr>
-              <w:t>Jurisdiction filter segmented buttons toggling between City-wide and Barangay-level ordinances.</w:t>
+              <w:t>Legislative year selector dropdown isolating ordinances enacted in specific legislative terms.</w:t>
             </w:r>
           </w:p>
         </w:tc>
@@ -5620,7 +5700,7 @@
       <w:r>
         <w:drawing>
           <wp:inline xmlns:a="http://schemas.openxmlformats.org/drawingml/2006/main" xmlns:pic="http://schemas.openxmlformats.org/drawingml/2006/picture">
-            <wp:extent cx="5715000" cy="3571875"/>
+            <wp:extent cx="5715000" cy="3429000"/>
             <wp:docPr id="6" name="Picture 6"/>
             <wp:cNvGraphicFramePr>
               <a:graphicFrameLocks noChangeAspect="1"/>
@@ -5641,7 +5721,7 @@
                   <pic:spPr>
                     <a:xfrm>
                       <a:off x="0" y="0"/>
-                      <a:ext cx="5715000" cy="3571875"/>
+                      <a:ext cx="5715000" cy="3429000"/>
                     </a:xfrm>
                     <a:prstGeom prst="rect"/>
                   </pic:spPr>
@@ -5908,7 +5988,7 @@
                 <w:color w:val="0F172A"/>
                 <w:sz w:val="19"/>
               </w:rPr>
-              <w:t>Legislative Metadata (Date, Series Year, Enacting Body)</w:t>
+              <w:t>Legislative Metadata Bar (Date Enacted &amp; Territorial Coverage)</w:t>
             </w:r>
           </w:p>
         </w:tc>
@@ -5988,7 +6068,7 @@
                 <w:color w:val="0F172A"/>
                 <w:sz w:val="19"/>
               </w:rPr>
-              <w:t>Structured Legal Articles &amp; Provisions (Split-Screen Left)</w:t>
+              <w:t>Executive Legal Summary &amp; Background Rationale Box</w:t>
             </w:r>
           </w:p>
         </w:tc>
@@ -6013,7 +6093,7 @@
                 <w:color w:val="334155"/>
                 <w:sz w:val="18"/>
               </w:rPr>
-              <w:t>Structured legal provisions broken down into numbered articles, sections, and prohibited acts.</w:t>
+              <w:t>Executive legal summary box providing plain-language overview of the legislative mandate.</w:t>
             </w:r>
           </w:p>
         </w:tc>
@@ -6068,7 +6148,7 @@
                 <w:color w:val="0F172A"/>
                 <w:sz w:val="19"/>
               </w:rPr>
-              <w:t>Summary, Sanctions &amp; Tiered Penalties Card (Right)</w:t>
+              <w:t>Open Official Scanned PDF Viewer Action Button</w:t>
             </w:r>
           </w:p>
         </w:tc>
@@ -6093,7 +6173,7 @@
                 <w:color w:val="334155"/>
                 <w:sz w:val="18"/>
               </w:rPr>
-              <w:t>Prominent sanctions sidebar detailing tiered monetary fines and community service consequences.</w:t>
+              <w:t>High-priority action button launching the interactive scanned PDF document modal dialog.</w:t>
             </w:r>
           </w:p>
         </w:tc>
@@ -6148,7 +6228,7 @@
                 <w:color w:val="0F172A"/>
                 <w:sz w:val="19"/>
               </w:rPr>
-              <w:t>Open Official PDF Document Viewer Button</w:t>
+              <w:t>Structured Legal Articles &amp; Sections Container</w:t>
             </w:r>
           </w:p>
         </w:tc>
@@ -6173,7 +6253,7 @@
                 <w:color w:val="334155"/>
                 <w:sz w:val="18"/>
               </w:rPr>
-              <w:t>High-priority action button launching the interactive scanned PDF document modal dialog.</w:t>
+              <w:t>Structured legal provisions broken down into numbered articles, sections, and prohibited acts.</w:t>
             </w:r>
           </w:p>
         </w:tc>
@@ -6297,7 +6377,7 @@
       <w:r>
         <w:drawing>
           <wp:inline xmlns:a="http://schemas.openxmlformats.org/drawingml/2006/main" xmlns:pic="http://schemas.openxmlformats.org/drawingml/2006/picture">
-            <wp:extent cx="5715000" cy="3571875"/>
+            <wp:extent cx="5715000" cy="3429000"/>
             <wp:docPr id="7" name="Picture 7"/>
             <wp:cNvGraphicFramePr>
               <a:graphicFrameLocks noChangeAspect="1"/>
@@ -6318,7 +6398,7 @@
                   <pic:spPr>
                     <a:xfrm>
                       <a:off x="0" y="0"/>
-                      <a:ext cx="5715000" cy="3571875"/>
+                      <a:ext cx="5715000" cy="3429000"/>
                     </a:xfrm>
                     <a:prstGeom prst="rect"/>
                   </pic:spPr>
@@ -6505,7 +6585,7 @@
                 <w:color w:val="0F172A"/>
                 <w:sz w:val="19"/>
               </w:rPr>
-              <w:t>Official Document Modal Dialog Header</w:t>
+              <w:t>Official Document Modal Dialog Header &amp; Identifier</w:t>
             </w:r>
           </w:p>
         </w:tc>
@@ -6530,7 +6610,7 @@
                 <w:color w:val="334155"/>
                 <w:sz w:val="18"/>
               </w:rPr>
-              <w:t>Accessible modal container with resolution identification and WCAG-compliant dialog focus lock.</w:t>
+              <w:t>Official document modal dialog header displaying resolution title and unique code.</w:t>
             </w:r>
           </w:p>
         </w:tc>
@@ -6665,7 +6745,7 @@
                 <w:color w:val="0F172A"/>
                 <w:sz w:val="19"/>
               </w:rPr>
-              <w:t>Interactive Zoom &amp; Pagination Controls</w:t>
+              <w:t>Direct PDF File Download Action Button</w:t>
             </w:r>
           </w:p>
         </w:tc>
@@ -6690,7 +6770,7 @@
                 <w:color w:val="334155"/>
                 <w:sz w:val="18"/>
               </w:rPr>
-              <w:t>Interactive magnification controls (+ / - / Reset) for inspecting physical signatures and dry seals.</w:t>
+              <w:t>Direct download button retrieving the official PDF file to the resident's local storage.</w:t>
             </w:r>
           </w:p>
         </w:tc>
@@ -6745,7 +6825,7 @@
                 <w:color w:val="0F172A"/>
                 <w:sz w:val="19"/>
               </w:rPr>
-              <w:t>Direct PDF File Download Action Button</w:t>
+              <w:t>Open in Dedicated Full-Screen Tab Button</w:t>
             </w:r>
           </w:p>
         </w:tc>
@@ -6770,7 +6850,7 @@
                 <w:color w:val="334155"/>
                 <w:sz w:val="18"/>
               </w:rPr>
-              <w:t>Direct download button retrieving the official PDF file to the resident's local storage.</w:t>
+              <w:t>Open in dedicated browser tab action button for full-screen inspection and local printing.</w:t>
             </w:r>
           </w:p>
         </w:tc>
@@ -6997,7 +7077,7 @@
       <w:r>
         <w:drawing>
           <wp:inline xmlns:a="http://schemas.openxmlformats.org/drawingml/2006/main" xmlns:pic="http://schemas.openxmlformats.org/drawingml/2006/picture">
-            <wp:extent cx="5715000" cy="3571875"/>
+            <wp:extent cx="5715000" cy="3429000"/>
             <wp:docPr id="8" name="Picture 8"/>
             <wp:cNvGraphicFramePr>
               <a:graphicFrameLocks noChangeAspect="1"/>
@@ -7018,7 +7098,7 @@
                   <pic:spPr>
                     <a:xfrm>
                       <a:off x="0" y="0"/>
-                      <a:ext cx="5715000" cy="3571875"/>
+                      <a:ext cx="5715000" cy="3429000"/>
                     </a:xfrm>
                     <a:prstGeom prst="rect"/>
                   </pic:spPr>
@@ -7205,7 +7285,7 @@
                 <w:color w:val="0F172A"/>
                 <w:sz w:val="19"/>
               </w:rPr>
-              <w:t>Civic Safety &amp; Informational Disclaimer Banner</w:t>
+              <w:t>Civic Safety &amp; Informational Disclaimer Notice</w:t>
             </w:r>
           </w:p>
         </w:tc>
@@ -7285,7 +7365,7 @@
                 <w:color w:val="0F172A"/>
                 <w:sz w:val="19"/>
               </w:rPr>
-              <w:t>Quick Common Inquiry Action Buttons</w:t>
+              <w:t>Preset Quick Action Inquiry Buttons</w:t>
             </w:r>
           </w:p>
         </w:tc>
@@ -7365,7 +7445,7 @@
                 <w:color w:val="0F172A"/>
                 <w:sz w:val="19"/>
               </w:rPr>
-              <w:t>Citizen Inquiry Message Bubble</w:t>
+              <w:t>Bilingual Question Input Field</w:t>
             </w:r>
           </w:p>
         </w:tc>
@@ -7390,7 +7470,7 @@
                 <w:color w:val="334155"/>
                 <w:sz w:val="18"/>
               </w:rPr>
-              <w:t>Citizen message bubble reflecting natural English, Tagalog, or Taglish inquiry phrasing.</w:t>
+              <w:t>Bilingual prompt input supporting conversational inquiries with debounced token streaming.</w:t>
             </w:r>
           </w:p>
         </w:tc>
@@ -7445,7 +7525,7 @@
                 <w:color w:val="0F172A"/>
                 <w:sz w:val="19"/>
               </w:rPr>
-              <w:t>Gemini RAG Assistant Answer with Ordinance Citations</w:t>
+              <w:t>Send Message Action Button</w:t>
             </w:r>
           </w:p>
         </w:tc>
@@ -7470,7 +7550,7 @@
                 <w:color w:val="334155"/>
                 <w:sz w:val="18"/>
               </w:rPr>
-              <w:t>Gemini RAG assistant response citing exact resolution numbers, article clauses, and tiered penalty schedules.</w:t>
+              <w:t>Message dispatch button transmitting prompt to the Gemini 3.5 Flash Lite retrieval pipeline.</w:t>
             </w:r>
           </w:p>
         </w:tc>
@@ -7525,7 +7605,7 @@
                 <w:color w:val="0F172A"/>
                 <w:sz w:val="19"/>
               </w:rPr>
-              <w:t>Bilingual Question Input Field</w:t>
+              <w:t>Official Informational Banner &amp; Citation Notice</w:t>
             </w:r>
           </w:p>
         </w:tc>
@@ -7550,87 +7630,7 @@
                 <w:color w:val="334155"/>
                 <w:sz w:val="18"/>
               </w:rPr>
-              <w:t>Bilingual prompt input supporting conversational inquiries with debounced token streaming.</w:t>
-            </w:r>
-          </w:p>
-        </w:tc>
-      </w:tr>
-      <w:tr>
-        <w:tc>
-          <w:tcPr>
-            <w:tcW w:type="dxa" w:w="864"/>
-            <w:shd w:fill="F8FAFC"/>
-            <w:tcMar>
-              <w:top w:w="80" w:type="dxa"/>
-              <w:bottom w:w="80" w:type="dxa"/>
-              <w:left w:w="120" w:type="dxa"/>
-              <w:right w:w="120" w:type="dxa"/>
-            </w:tcMar>
-          </w:tcPr>
-          <w:p>
-            <w:pPr>
-              <w:spacing w:before="0" w:after="0"/>
-              <w:jc w:val="center"/>
-            </w:pPr>
-            <w:r>
-              <w:rPr>
-                <w:rFonts w:ascii="Arial" w:hAnsi="Arial"/>
-                <w:b/>
-                <w:color w:val="047857"/>
-                <w:sz w:val="19"/>
-              </w:rPr>
-              <w:t>6</w:t>
-            </w:r>
-          </w:p>
-        </w:tc>
-        <w:tc>
-          <w:tcPr>
-            <w:tcW w:type="dxa" w:w="3168"/>
-            <w:shd w:fill="F8FAFC"/>
-            <w:tcMar>
-              <w:top w:w="80" w:type="dxa"/>
-              <w:bottom w:w="80" w:type="dxa"/>
-              <w:left w:w="120" w:type="dxa"/>
-              <w:right w:w="120" w:type="dxa"/>
-            </w:tcMar>
-          </w:tcPr>
-          <w:p>
-            <w:pPr>
-              <w:spacing w:before="0" w:after="0"/>
-            </w:pPr>
-            <w:r>
-              <w:rPr>
-                <w:rFonts w:ascii="Arial" w:hAnsi="Arial"/>
-                <w:b/>
-                <w:color w:val="0F172A"/>
-                <w:sz w:val="19"/>
-              </w:rPr>
-              <w:t>Send Message Action Button</w:t>
-            </w:r>
-          </w:p>
-        </w:tc>
-        <w:tc>
-          <w:tcPr>
-            <w:tcW w:type="dxa" w:w="5328"/>
-            <w:shd w:fill="F8FAFC"/>
-            <w:tcMar>
-              <w:top w:w="80" w:type="dxa"/>
-              <w:bottom w:w="80" w:type="dxa"/>
-              <w:left w:w="120" w:type="dxa"/>
-              <w:right w:w="120" w:type="dxa"/>
-            </w:tcMar>
-          </w:tcPr>
-          <w:p>
-            <w:pPr>
-              <w:spacing w:before="0" w:after="0" w:line="276" w:lineRule="auto"/>
-            </w:pPr>
-            <w:r>
-              <w:rPr>
-                <w:rFonts w:ascii="Arial" w:hAnsi="Arial"/>
-                <w:color w:val="334155"/>
-                <w:sz w:val="18"/>
-              </w:rPr>
-              <w:t>Message dispatch button transmitting prompt to the Gemini 3.5 Flash Lite retrieval pipeline.</w:t>
+              <w:t>Bottom civic disclaimer reminding citizens to verify official texts for formal legal proceedings.</w:t>
             </w:r>
           </w:p>
         </w:tc>
@@ -7800,7 +7800,7 @@
       <w:r>
         <w:drawing>
           <wp:inline xmlns:a="http://schemas.openxmlformats.org/drawingml/2006/main" xmlns:pic="http://schemas.openxmlformats.org/drawingml/2006/picture">
-            <wp:extent cx="5715000" cy="3571875"/>
+            <wp:extent cx="5715000" cy="3429000"/>
             <wp:docPr id="9" name="Picture 9"/>
             <wp:cNvGraphicFramePr>
               <a:graphicFrameLocks noChangeAspect="1"/>
@@ -7821,7 +7821,7 @@
                   <pic:spPr>
                     <a:xfrm>
                       <a:off x="0" y="0"/>
-                      <a:ext cx="5715000" cy="3571875"/>
+                      <a:ext cx="5715000" cy="3429000"/>
                     </a:xfrm>
                     <a:prstGeom prst="rect"/>
                   </pic:spPr>
@@ -8273,7 +8273,7 @@
                 <w:color w:val="334155"/>
                 <w:sz w:val="18"/>
               </w:rPr>
-              <w:t>Location landmark input capturing precise neighborhood coordinates (purok, street, corner).</w:t>
+              <w:t>Incident subject input capturing a concise summary of the observed ordinance violation.</w:t>
             </w:r>
           </w:p>
         </w:tc>
@@ -8408,7 +8408,7 @@
                 <w:color w:val="0F172A"/>
                 <w:sz w:val="19"/>
               </w:rPr>
-              <w:t>Anonymous Reporting Toggle &amp; Contact Fields</w:t>
+              <w:t>Anonymous Reporting Toggle</w:t>
             </w:r>
           </w:p>
         </w:tc>
@@ -8614,7 +8614,7 @@
       <w:r>
         <w:drawing>
           <wp:inline xmlns:a="http://schemas.openxmlformats.org/drawingml/2006/main" xmlns:pic="http://schemas.openxmlformats.org/drawingml/2006/picture">
-            <wp:extent cx="5715000" cy="3571875"/>
+            <wp:extent cx="5715000" cy="3429000"/>
             <wp:docPr id="10" name="Picture 10"/>
             <wp:cNvGraphicFramePr>
               <a:graphicFrameLocks noChangeAspect="1"/>
@@ -8635,7 +8635,7 @@
                   <pic:spPr>
                     <a:xfrm>
                       <a:off x="0" y="0"/>
-                      <a:ext cx="5715000" cy="3571875"/>
+                      <a:ext cx="5715000" cy="3429000"/>
                     </a:xfrm>
                     <a:prstGeom prst="rect"/>
                   </pic:spPr>
@@ -8847,7 +8847,7 @@
                 <w:color w:val="334155"/>
                 <w:sz w:val="18"/>
               </w:rPr>
-              <w:t>Role-alert confirmation banner signaling successful transmission to local barangay authorities.</w:t>
+              <w:t>Official confirmation alert banner verifying direct submission to the target barangay hall.</w:t>
             </w:r>
           </w:p>
         </w:tc>
@@ -8902,7 +8902,7 @@
                 <w:color w:val="0F172A"/>
                 <w:sz w:val="19"/>
               </w:rPr>
-              <w:t>Target Barangay Hall Routing Notification</w:t>
+              <w:t>Draft Auto-Save Status Bar</w:t>
             </w:r>
           </w:p>
         </w:tc>
@@ -8927,7 +8927,7 @@
                 <w:color w:val="334155"/>
                 <w:sz w:val="18"/>
               </w:rPr>
-              <w:t>Designated destination barangay hall confirmation verifying operational jurisdiction routing.</w:t>
+              <w:t>Client-side draft persistence status confirming the form state has been safely cleared.</w:t>
             </w:r>
           </w:p>
         </w:tc>
@@ -8982,7 +8982,7 @@
                 <w:color w:val="0F172A"/>
                 <w:sz w:val="19"/>
               </w:rPr>
-              <w:t>Official Tracking Reference Code</w:t>
+              <w:t>Reset &amp; Clear Form Action Button</w:t>
             </w:r>
           </w:p>
         </w:tc>
@@ -9007,87 +9007,7 @@
                 <w:color w:val="334155"/>
                 <w:sz w:val="18"/>
               </w:rPr>
-              <w:t>Cryptographic unique tracking code allowing residents to verify follow-up action with officials.</w:t>
-            </w:r>
-          </w:p>
-        </w:tc>
-      </w:tr>
-      <w:tr>
-        <w:tc>
-          <w:tcPr>
-            <w:tcW w:type="dxa" w:w="864"/>
-            <w:shd w:fill="F8FAFC"/>
-            <w:tcMar>
-              <w:top w:w="80" w:type="dxa"/>
-              <w:bottom w:w="80" w:type="dxa"/>
-              <w:left w:w="120" w:type="dxa"/>
-              <w:right w:w="120" w:type="dxa"/>
-            </w:tcMar>
-          </w:tcPr>
-          <w:p>
-            <w:pPr>
-              <w:spacing w:before="0" w:after="0"/>
-              <w:jc w:val="center"/>
-            </w:pPr>
-            <w:r>
-              <w:rPr>
-                <w:rFonts w:ascii="Arial" w:hAnsi="Arial"/>
-                <w:b/>
-                <w:color w:val="047857"/>
-                <w:sz w:val="19"/>
-              </w:rPr>
-              <w:t>4</w:t>
-            </w:r>
-          </w:p>
-        </w:tc>
-        <w:tc>
-          <w:tcPr>
-            <w:tcW w:type="dxa" w:w="3168"/>
-            <w:shd w:fill="F8FAFC"/>
-            <w:tcMar>
-              <w:top w:w="80" w:type="dxa"/>
-              <w:bottom w:w="80" w:type="dxa"/>
-              <w:left w:w="120" w:type="dxa"/>
-              <w:right w:w="120" w:type="dxa"/>
-            </w:tcMar>
-          </w:tcPr>
-          <w:p>
-            <w:pPr>
-              <w:spacing w:before="0" w:after="0"/>
-            </w:pPr>
-            <w:r>
-              <w:rPr>
-                <w:rFonts w:ascii="Arial" w:hAnsi="Arial"/>
-                <w:b/>
-                <w:color w:val="0F172A"/>
-                <w:sz w:val="19"/>
-              </w:rPr>
-              <w:t>File Another Report / Return Option</w:t>
-            </w:r>
-          </w:p>
-        </w:tc>
-        <w:tc>
-          <w:tcPr>
-            <w:tcW w:type="dxa" w:w="5328"/>
-            <w:shd w:fill="F8FAFC"/>
-            <w:tcMar>
-              <w:top w:w="80" w:type="dxa"/>
-              <w:bottom w:w="80" w:type="dxa"/>
-              <w:left w:w="120" w:type="dxa"/>
-              <w:right w:w="120" w:type="dxa"/>
-            </w:tcMar>
-          </w:tcPr>
-          <w:p>
-            <w:pPr>
-              <w:spacing w:before="0" w:after="0" w:line="276" w:lineRule="auto"/>
-            </w:pPr>
-            <w:r>
-              <w:rPr>
-                <w:rFonts w:ascii="Arial" w:hAnsi="Arial"/>
-                <w:color w:val="334155"/>
-                <w:sz w:val="18"/>
-              </w:rPr>
-              <w:t>Form reset action button allowing residents to submit another report or navigate back home.</w:t>
+              <w:t>Reset action button allowing the resident to clear form fields and prepare another submission.</w:t>
             </w:r>
           </w:p>
         </w:tc>
@@ -9211,7 +9131,7 @@
       <w:r>
         <w:drawing>
           <wp:inline xmlns:a="http://schemas.openxmlformats.org/drawingml/2006/main" xmlns:pic="http://schemas.openxmlformats.org/drawingml/2006/picture">
-            <wp:extent cx="5715000" cy="3571875"/>
+            <wp:extent cx="5715000" cy="3429000"/>
             <wp:docPr id="11" name="Picture 11"/>
             <wp:cNvGraphicFramePr>
               <a:graphicFrameLocks noChangeAspect="1"/>
@@ -9232,7 +9152,7 @@
                   <pic:spPr>
                     <a:xfrm>
                       <a:off x="0" y="0"/>
-                      <a:ext cx="5715000" cy="3571875"/>
+                      <a:ext cx="5715000" cy="3429000"/>
                     </a:xfrm>
                     <a:prstGeom prst="rect"/>
                   </pic:spPr>
@@ -9499,7 +9419,7 @@
                 <w:color w:val="0F172A"/>
                 <w:sz w:val="19"/>
               </w:rPr>
-              <w:t>News Category Filter Tabs (Lahat, Lungsod, Barangay)</w:t>
+              <w:t>Official LGU Public Authority Badge</w:t>
             </w:r>
           </w:p>
         </w:tc>
@@ -9524,7 +9444,7 @@
                 <w:color w:val="334155"/>
                 <w:sz w:val="18"/>
               </w:rPr>
-              <w:t>Category filter tabs toggling between city-wide advisories and localized barangay updates.</w:t>
+              <w:t>Official Cabanatuan LGU public authority badge validating authenticity of published notices.</w:t>
             </w:r>
           </w:p>
         </w:tc>
@@ -9579,7 +9499,7 @@
                 <w:color w:val="0F172A"/>
                 <w:sz w:val="19"/>
               </w:rPr>
-              <w:t>Pinned Official Executive Advisory Card</w:t>
+              <w:t>Official Executive Advisory Card</w:t>
             </w:r>
           </w:p>
         </w:tc>
@@ -9604,7 +9524,7 @@
                 <w:color w:val="334155"/>
                 <w:sz w:val="18"/>
               </w:rPr>
-              <w:t>Prominent pinned announcement card displaying urgent public notices and executive directives.</w:t>
+              <w:t>Prominent official executive advisory card highlighting priority legislative announcements.</w:t>
             </w:r>
           </w:p>
         </w:tc>
@@ -9659,7 +9579,7 @@
                 <w:color w:val="0F172A"/>
                 <w:sz w:val="19"/>
               </w:rPr>
-              <w:t>Chronological Community News Feed</w:t>
+              <w:t>Publication Date &amp; Civic Category Badge</w:t>
             </w:r>
           </w:p>
         </w:tc>
@@ -9684,7 +9604,87 @@
                 <w:color w:val="334155"/>
                 <w:sz w:val="18"/>
               </w:rPr>
-              <w:t>Chronological advisory stream with publication timestamps, authoring agency, and read-more modals.</w:t>
+              <w:t>Official timestamp and policy categorization badge denoting when the notice was enacted.</w:t>
+            </w:r>
+          </w:p>
+        </w:tc>
+      </w:tr>
+      <w:tr>
+        <w:tc>
+          <w:tcPr>
+            <w:tcW w:type="dxa" w:w="864"/>
+            <w:shd w:fill="FFFFFF"/>
+            <w:tcMar>
+              <w:top w:w="80" w:type="dxa"/>
+              <w:bottom w:w="80" w:type="dxa"/>
+              <w:left w:w="120" w:type="dxa"/>
+              <w:right w:w="120" w:type="dxa"/>
+            </w:tcMar>
+          </w:tcPr>
+          <w:p>
+            <w:pPr>
+              <w:spacing w:before="0" w:after="0"/>
+              <w:jc w:val="center"/>
+            </w:pPr>
+            <w:r>
+              <w:rPr>
+                <w:rFonts w:ascii="Arial" w:hAnsi="Arial"/>
+                <w:b/>
+                <w:color w:val="047857"/>
+                <w:sz w:val="19"/>
+              </w:rPr>
+              <w:t>5</w:t>
+            </w:r>
+          </w:p>
+        </w:tc>
+        <w:tc>
+          <w:tcPr>
+            <w:tcW w:type="dxa" w:w="3168"/>
+            <w:shd w:fill="FFFFFF"/>
+            <w:tcMar>
+              <w:top w:w="80" w:type="dxa"/>
+              <w:bottom w:w="80" w:type="dxa"/>
+              <w:left w:w="120" w:type="dxa"/>
+              <w:right w:w="120" w:type="dxa"/>
+            </w:tcMar>
+          </w:tcPr>
+          <w:p>
+            <w:pPr>
+              <w:spacing w:before="0" w:after="0"/>
+            </w:pPr>
+            <w:r>
+              <w:rPr>
+                <w:rFonts w:ascii="Arial" w:hAnsi="Arial"/>
+                <w:b/>
+                <w:color w:val="0F172A"/>
+                <w:sz w:val="19"/>
+              </w:rPr>
+              <w:t>Executive Directive Content Narrative</w:t>
+            </w:r>
+          </w:p>
+        </w:tc>
+        <w:tc>
+          <w:tcPr>
+            <w:tcW w:type="dxa" w:w="5328"/>
+            <w:shd w:fill="FFFFFF"/>
+            <w:tcMar>
+              <w:top w:w="80" w:type="dxa"/>
+              <w:bottom w:w="80" w:type="dxa"/>
+              <w:left w:w="120" w:type="dxa"/>
+              <w:right w:w="120" w:type="dxa"/>
+            </w:tcMar>
+          </w:tcPr>
+          <w:p>
+            <w:pPr>
+              <w:spacing w:before="0" w:after="0" w:line="276" w:lineRule="auto"/>
+            </w:pPr>
+            <w:r>
+              <w:rPr>
+                <w:rFonts w:ascii="Arial" w:hAnsi="Arial"/>
+                <w:color w:val="334155"/>
+                <w:sz w:val="18"/>
+              </w:rPr>
+              <w:t>Comprehensive text narrative detailing civic guidelines, meeting schedules, and public directives.</w:t>
             </w:r>
           </w:p>
         </w:tc>
@@ -9862,7 +9862,7 @@
       <w:r>
         <w:drawing>
           <wp:inline xmlns:a="http://schemas.openxmlformats.org/drawingml/2006/main" xmlns:pic="http://schemas.openxmlformats.org/drawingml/2006/picture">
-            <wp:extent cx="5715000" cy="3571875"/>
+            <wp:extent cx="5715000" cy="3429000"/>
             <wp:docPr id="12" name="Picture 12"/>
             <wp:cNvGraphicFramePr>
               <a:graphicFrameLocks noChangeAspect="1"/>
@@ -9883,7 +9883,7 @@
                   <pic:spPr>
                     <a:xfrm>
                       <a:off x="0" y="0"/>
-                      <a:ext cx="5715000" cy="3571875"/>
+                      <a:ext cx="5715000" cy="3429000"/>
                     </a:xfrm>
                     <a:prstGeom prst="rect"/>
                   </pic:spPr>
@@ -10070,7 +10070,7 @@
                 <w:color w:val="0F172A"/>
                 <w:sz w:val="19"/>
               </w:rPr>
-              <w:t>Barangay-Scoped Header ('Barangay Governance Dashboard — Camp Tinio')</w:t>
+              <w:t>Barangay Governance Dashboard Header</w:t>
             </w:r>
           </w:p>
         </w:tc>
@@ -10150,7 +10150,7 @@
                 <w:color w:val="0F172A"/>
                 <w:sz w:val="19"/>
               </w:rPr>
-              <w:t>Local Enacted Ordinances Metric Card</w:t>
+              <w:t>Local Governance Welcome Banner</w:t>
             </w:r>
           </w:p>
         </w:tc>
@@ -10175,7 +10175,7 @@
                 <w:color w:val="334155"/>
                 <w:sz w:val="18"/>
               </w:rPr>
-              <w:t>Active local ordinances counter tracking enacted barangay resolutions within the jurisdiction.</w:t>
+              <w:t>Local governance welcome banner summarizing current operational status for the barangay council.</w:t>
             </w:r>
           </w:p>
         </w:tc>
@@ -10230,7 +10230,7 @@
                 <w:color w:val="0F172A"/>
                 <w:sz w:val="19"/>
               </w:rPr>
-              <w:t>Pending Legislative Proposals Metric Card</w:t>
+              <w:t>Submit New Ordinance Quick Action Button</w:t>
             </w:r>
           </w:p>
         </w:tc>
@@ -10255,7 +10255,7 @@
                 <w:color w:val="334155"/>
                 <w:sz w:val="18"/>
               </w:rPr>
-              <w:t>Pending proposals counter monitoring legislation submitted to City Hall awaiting LGU approval.</w:t>
+              <w:t>Prominent quick-action button initiating a new barangay ordinance proposal transmittal.</w:t>
             </w:r>
           </w:p>
         </w:tc>
@@ -10310,7 +10310,7 @@
                 <w:color w:val="0F172A"/>
                 <w:sz w:val="19"/>
               </w:rPr>
-              <w:t>Active Community Incident Reports Metric Card</w:t>
+              <w:t>Local Enacted Ordinances Metric Card</w:t>
             </w:r>
           </w:p>
         </w:tc>
@@ -10335,7 +10335,7 @@
                 <w:color w:val="334155"/>
                 <w:sz w:val="18"/>
               </w:rPr>
-              <w:t>Community reports KPI displaying incoming violation reports filed by barangay residents.</w:t>
+              <w:t>Active local ordinances counter tracking enacted barangay resolutions within the jurisdiction.</w:t>
             </w:r>
           </w:p>
         </w:tc>
@@ -10390,7 +10390,7 @@
                 <w:color w:val="0F172A"/>
                 <w:sz w:val="19"/>
               </w:rPr>
-              <w:t>Recent Community Incident Triage Feed</w:t>
+              <w:t>Pending Legislative Proposals Metric Card</w:t>
             </w:r>
           </w:p>
         </w:tc>
@@ -10415,7 +10415,7 @@
                 <w:color w:val="334155"/>
                 <w:sz w:val="18"/>
               </w:rPr>
-              <w:t>Real-time constituent incident report stream displaying recent submissions needing inspection.</w:t>
+              <w:t>Pending proposals counter monitoring legislation submitted to City Hall awaiting LGU approval.</w:t>
             </w:r>
           </w:p>
         </w:tc>
@@ -10470,7 +10470,7 @@
                 <w:color w:val="0F172A"/>
                 <w:sz w:val="19"/>
               </w:rPr>
-              <w:t>Barangay Admin Dedicated Navigation Sidebar</w:t>
+              <w:t>Active Community Incident Reports Metric Card</w:t>
             </w:r>
           </w:p>
         </w:tc>
@@ -10478,6 +10478,86 @@
           <w:tcPr>
             <w:tcW w:type="dxa" w:w="5328"/>
             <w:shd w:fill="F8FAFC"/>
+            <w:tcMar>
+              <w:top w:w="80" w:type="dxa"/>
+              <w:bottom w:w="80" w:type="dxa"/>
+              <w:left w:w="120" w:type="dxa"/>
+              <w:right w:w="120" w:type="dxa"/>
+            </w:tcMar>
+          </w:tcPr>
+          <w:p>
+            <w:pPr>
+              <w:spacing w:before="0" w:after="0" w:line="276" w:lineRule="auto"/>
+            </w:pPr>
+            <w:r>
+              <w:rPr>
+                <w:rFonts w:ascii="Arial" w:hAnsi="Arial"/>
+                <w:color w:val="334155"/>
+                <w:sz w:val="18"/>
+              </w:rPr>
+              <w:t>Community reports KPI displaying incoming violation reports filed by barangay residents.</w:t>
+            </w:r>
+          </w:p>
+        </w:tc>
+      </w:tr>
+      <w:tr>
+        <w:tc>
+          <w:tcPr>
+            <w:tcW w:type="dxa" w:w="864"/>
+            <w:shd w:fill="FFFFFF"/>
+            <w:tcMar>
+              <w:top w:w="80" w:type="dxa"/>
+              <w:bottom w:w="80" w:type="dxa"/>
+              <w:left w:w="120" w:type="dxa"/>
+              <w:right w:w="120" w:type="dxa"/>
+            </w:tcMar>
+          </w:tcPr>
+          <w:p>
+            <w:pPr>
+              <w:spacing w:before="0" w:after="0"/>
+              <w:jc w:val="center"/>
+            </w:pPr>
+            <w:r>
+              <w:rPr>
+                <w:rFonts w:ascii="Arial" w:hAnsi="Arial"/>
+                <w:b/>
+                <w:color w:val="047857"/>
+                <w:sz w:val="19"/>
+              </w:rPr>
+              <w:t>7</w:t>
+            </w:r>
+          </w:p>
+        </w:tc>
+        <w:tc>
+          <w:tcPr>
+            <w:tcW w:type="dxa" w:w="3168"/>
+            <w:shd w:fill="FFFFFF"/>
+            <w:tcMar>
+              <w:top w:w="80" w:type="dxa"/>
+              <w:bottom w:w="80" w:type="dxa"/>
+              <w:left w:w="120" w:type="dxa"/>
+              <w:right w:w="120" w:type="dxa"/>
+            </w:tcMar>
+          </w:tcPr>
+          <w:p>
+            <w:pPr>
+              <w:spacing w:before="0" w:after="0"/>
+            </w:pPr>
+            <w:r>
+              <w:rPr>
+                <w:rFonts w:ascii="Arial" w:hAnsi="Arial"/>
+                <w:b/>
+                <w:color w:val="0F172A"/>
+                <w:sz w:val="19"/>
+              </w:rPr>
+              <w:t>Barangay Admin Dedicated Navigation Sidebar</w:t>
+            </w:r>
+          </w:p>
+        </w:tc>
+        <w:tc>
+          <w:tcPr>
+            <w:tcW w:type="dxa" w:w="5328"/>
+            <w:shd w:fill="FFFFFF"/>
             <w:tcMar>
               <w:top w:w="80" w:type="dxa"/>
               <w:bottom w:w="80" w:type="dxa"/>
@@ -10642,7 +10722,7 @@
       <w:r>
         <w:drawing>
           <wp:inline xmlns:a="http://schemas.openxmlformats.org/drawingml/2006/main" xmlns:pic="http://schemas.openxmlformats.org/drawingml/2006/picture">
-            <wp:extent cx="5715000" cy="3571875"/>
+            <wp:extent cx="5715000" cy="3429000"/>
             <wp:docPr id="13" name="Picture 13"/>
             <wp:cNvGraphicFramePr>
               <a:graphicFrameLocks noChangeAspect="1"/>
@@ -10663,7 +10743,7 @@
                   <pic:spPr>
                     <a:xfrm>
                       <a:off x="0" y="0"/>
-                      <a:ext cx="5715000" cy="3571875"/>
+                      <a:ext cx="5715000" cy="3429000"/>
                     </a:xfrm>
                     <a:prstGeom prst="rect"/>
                   </pic:spPr>
@@ -11319,7 +11399,7 @@
       <w:r>
         <w:drawing>
           <wp:inline xmlns:a="http://schemas.openxmlformats.org/drawingml/2006/main" xmlns:pic="http://schemas.openxmlformats.org/drawingml/2006/picture">
-            <wp:extent cx="5715000" cy="3571875"/>
+            <wp:extent cx="5715000" cy="3429000"/>
             <wp:docPr id="14" name="Picture 14"/>
             <wp:cNvGraphicFramePr>
               <a:graphicFrameLocks noChangeAspect="1"/>
@@ -11340,7 +11420,7 @@
                   <pic:spPr>
                     <a:xfrm>
                       <a:off x="0" y="0"/>
-                      <a:ext cx="5715000" cy="3571875"/>
+                      <a:ext cx="5715000" cy="3429000"/>
                     </a:xfrm>
                     <a:prstGeom prst="rect"/>
                   </pic:spPr>
@@ -11607,7 +11687,7 @@
                 <w:color w:val="0F172A"/>
                 <w:sz w:val="19"/>
               </w:rPr>
-              <w:t>Proposed Title &amp; Resolution Number Input Fields</w:t>
+              <w:t>Proposed Ordinance Title Input Field</w:t>
             </w:r>
           </w:p>
         </w:tc>
@@ -11632,7 +11712,7 @@
                 <w:color w:val="334155"/>
                 <w:sz w:val="18"/>
               </w:rPr>
-              <w:t>Title and resolution numbering inputs adhering to standard barangay legislative naming conventions.</w:t>
+              <w:t>Proposed ordinance title input adhering to standard barangay legislative naming conventions.</w:t>
             </w:r>
           </w:p>
         </w:tc>
@@ -11687,7 +11767,7 @@
                 <w:color w:val="0F172A"/>
                 <w:sz w:val="19"/>
               </w:rPr>
-              <w:t>Legislative Category &amp; Year Series Dropdowns</w:t>
+              <w:t>Legislative Category Dropdown</w:t>
             </w:r>
           </w:p>
         </w:tc>
@@ -11712,7 +11792,7 @@
                 <w:color w:val="334155"/>
                 <w:sz w:val="18"/>
               </w:rPr>
-              <w:t>Categorization and enactment series selectors mapping the ordinance to city governance domains.</w:t>
+              <w:t>Legislative category selector mapping the ordinance to city governance domains.</w:t>
             </w:r>
           </w:p>
         </w:tc>
@@ -11767,7 +11847,7 @@
                 <w:color w:val="0F172A"/>
                 <w:sz w:val="19"/>
               </w:rPr>
-              <w:t>Legal Summary &amp; Prohibited Acts Content Fields</w:t>
+              <w:t>Save as Draft Action Button (Internal Staging)</w:t>
             </w:r>
           </w:p>
         </w:tc>
@@ -11792,7 +11872,7 @@
                 <w:color w:val="334155"/>
                 <w:sz w:val="18"/>
               </w:rPr>
-              <w:t>Legislative narrative fields for encoding background rationale, prohibited acts, and local coverage.</w:t>
+              <w:t>Draft saving action button persisting work-in-progress to the database without alerting City Hall.</w:t>
             </w:r>
           </w:p>
         </w:tc>
@@ -11847,7 +11927,7 @@
                 <w:color w:val="0F172A"/>
                 <w:sz w:val="19"/>
               </w:rPr>
-              <w:t>Save as Draft Action Button (Internal Staging)</w:t>
+              <w:t>Submit to LGU for Approval Button (Official Transmittal)</w:t>
             </w:r>
           </w:p>
         </w:tc>
@@ -11855,86 +11935,6 @@
           <w:tcPr>
             <w:tcW w:type="dxa" w:w="5328"/>
             <w:shd w:fill="FFFFFF"/>
-            <w:tcMar>
-              <w:top w:w="80" w:type="dxa"/>
-              <w:bottom w:w="80" w:type="dxa"/>
-              <w:left w:w="120" w:type="dxa"/>
-              <w:right w:w="120" w:type="dxa"/>
-            </w:tcMar>
-          </w:tcPr>
-          <w:p>
-            <w:pPr>
-              <w:spacing w:before="0" w:after="0" w:line="276" w:lineRule="auto"/>
-            </w:pPr>
-            <w:r>
-              <w:rPr>
-                <w:rFonts w:ascii="Arial" w:hAnsi="Arial"/>
-                <w:color w:val="334155"/>
-                <w:sz w:val="18"/>
-              </w:rPr>
-              <w:t>Draft saving action button persisting work-in-progress to the database without alerting City Hall.</w:t>
-            </w:r>
-          </w:p>
-        </w:tc>
-      </w:tr>
-      <w:tr>
-        <w:tc>
-          <w:tcPr>
-            <w:tcW w:type="dxa" w:w="864"/>
-            <w:shd w:fill="F8FAFC"/>
-            <w:tcMar>
-              <w:top w:w="80" w:type="dxa"/>
-              <w:bottom w:w="80" w:type="dxa"/>
-              <w:left w:w="120" w:type="dxa"/>
-              <w:right w:w="120" w:type="dxa"/>
-            </w:tcMar>
-          </w:tcPr>
-          <w:p>
-            <w:pPr>
-              <w:spacing w:before="0" w:after="0"/>
-              <w:jc w:val="center"/>
-            </w:pPr>
-            <w:r>
-              <w:rPr>
-                <w:rFonts w:ascii="Arial" w:hAnsi="Arial"/>
-                <w:b/>
-                <w:color w:val="047857"/>
-                <w:sz w:val="19"/>
-              </w:rPr>
-              <w:t>6</w:t>
-            </w:r>
-          </w:p>
-        </w:tc>
-        <w:tc>
-          <w:tcPr>
-            <w:tcW w:type="dxa" w:w="3168"/>
-            <w:shd w:fill="F8FAFC"/>
-            <w:tcMar>
-              <w:top w:w="80" w:type="dxa"/>
-              <w:bottom w:w="80" w:type="dxa"/>
-              <w:left w:w="120" w:type="dxa"/>
-              <w:right w:w="120" w:type="dxa"/>
-            </w:tcMar>
-          </w:tcPr>
-          <w:p>
-            <w:pPr>
-              <w:spacing w:before="0" w:after="0"/>
-            </w:pPr>
-            <w:r>
-              <w:rPr>
-                <w:rFonts w:ascii="Arial" w:hAnsi="Arial"/>
-                <w:b/>
-                <w:color w:val="0F172A"/>
-                <w:sz w:val="19"/>
-              </w:rPr>
-              <w:t>Submit to LGU for Approval Button (Official Transmittal)</w:t>
-            </w:r>
-          </w:p>
-        </w:tc>
-        <w:tc>
-          <w:tcPr>
-            <w:tcW w:type="dxa" w:w="5328"/>
-            <w:shd w:fill="F8FAFC"/>
             <w:tcMar>
               <w:top w:w="80" w:type="dxa"/>
               <w:bottom w:w="80" w:type="dxa"/>
@@ -12099,7 +12099,7 @@
       <w:r>
         <w:drawing>
           <wp:inline xmlns:a="http://schemas.openxmlformats.org/drawingml/2006/main" xmlns:pic="http://schemas.openxmlformats.org/drawingml/2006/picture">
-            <wp:extent cx="5715000" cy="3571875"/>
+            <wp:extent cx="5715000" cy="3429000"/>
             <wp:docPr id="15" name="Picture 15"/>
             <wp:cNvGraphicFramePr>
               <a:graphicFrameLocks noChangeAspect="1"/>
@@ -12120,7 +12120,7 @@
                   <pic:spPr>
                     <a:xfrm>
                       <a:off x="0" y="0"/>
-                      <a:ext cx="5715000" cy="3571875"/>
+                      <a:ext cx="5715000" cy="3429000"/>
                     </a:xfrm>
                     <a:prstGeom prst="rect"/>
                   </pic:spPr>
@@ -12493,166 +12493,6 @@
                 <w:sz w:val="18"/>
               </w:rPr>
               <w:t>Extraction execution trigger initiating automated text recognition and semantic clause extraction.</w:t>
-            </w:r>
-          </w:p>
-        </w:tc>
-      </w:tr>
-      <w:tr>
-        <w:tc>
-          <w:tcPr>
-            <w:tcW w:type="dxa" w:w="864"/>
-            <w:shd w:fill="F8FAFC"/>
-            <w:tcMar>
-              <w:top w:w="80" w:type="dxa"/>
-              <w:bottom w:w="80" w:type="dxa"/>
-              <w:left w:w="120" w:type="dxa"/>
-              <w:right w:w="120" w:type="dxa"/>
-            </w:tcMar>
-          </w:tcPr>
-          <w:p>
-            <w:pPr>
-              <w:spacing w:before="0" w:after="0"/>
-              <w:jc w:val="center"/>
-            </w:pPr>
-            <w:r>
-              <w:rPr>
-                <w:rFonts w:ascii="Arial" w:hAnsi="Arial"/>
-                <w:b/>
-                <w:color w:val="047857"/>
-                <w:sz w:val="19"/>
-              </w:rPr>
-              <w:t>4</w:t>
-            </w:r>
-          </w:p>
-        </w:tc>
-        <w:tc>
-          <w:tcPr>
-            <w:tcW w:type="dxa" w:w="3168"/>
-            <w:shd w:fill="F8FAFC"/>
-            <w:tcMar>
-              <w:top w:w="80" w:type="dxa"/>
-              <w:bottom w:w="80" w:type="dxa"/>
-              <w:left w:w="120" w:type="dxa"/>
-              <w:right w:w="120" w:type="dxa"/>
-            </w:tcMar>
-          </w:tcPr>
-          <w:p>
-            <w:pPr>
-              <w:spacing w:before="0" w:after="0"/>
-            </w:pPr>
-            <w:r>
-              <w:rPr>
-                <w:rFonts w:ascii="Arial" w:hAnsi="Arial"/>
-                <w:b/>
-                <w:color w:val="0F172A"/>
-                <w:sz w:val="19"/>
-              </w:rPr>
-              <w:t>Multimodal OCR Status &amp; Parsing Sequence</w:t>
-            </w:r>
-          </w:p>
-        </w:tc>
-        <w:tc>
-          <w:tcPr>
-            <w:tcW w:type="dxa" w:w="5328"/>
-            <w:shd w:fill="F8FAFC"/>
-            <w:tcMar>
-              <w:top w:w="80" w:type="dxa"/>
-              <w:bottom w:w="80" w:type="dxa"/>
-              <w:left w:w="120" w:type="dxa"/>
-              <w:right w:w="120" w:type="dxa"/>
-            </w:tcMar>
-          </w:tcPr>
-          <w:p>
-            <w:pPr>
-              <w:spacing w:before="0" w:after="0" w:line="276" w:lineRule="auto"/>
-            </w:pPr>
-            <w:r>
-              <w:rPr>
-                <w:rFonts w:ascii="Arial" w:hAnsi="Arial"/>
-                <w:color w:val="334155"/>
-                <w:sz w:val="18"/>
-              </w:rPr>
-              <w:t>Multi-stage animated progress indicator displaying OCR analysis, metadata parsing, and penalty structuring.</w:t>
-            </w:r>
-          </w:p>
-        </w:tc>
-      </w:tr>
-      <w:tr>
-        <w:tc>
-          <w:tcPr>
-            <w:tcW w:type="dxa" w:w="864"/>
-            <w:shd w:fill="FFFFFF"/>
-            <w:tcMar>
-              <w:top w:w="80" w:type="dxa"/>
-              <w:bottom w:w="80" w:type="dxa"/>
-              <w:left w:w="120" w:type="dxa"/>
-              <w:right w:w="120" w:type="dxa"/>
-            </w:tcMar>
-          </w:tcPr>
-          <w:p>
-            <w:pPr>
-              <w:spacing w:before="0" w:after="0"/>
-              <w:jc w:val="center"/>
-            </w:pPr>
-            <w:r>
-              <w:rPr>
-                <w:rFonts w:ascii="Arial" w:hAnsi="Arial"/>
-                <w:b/>
-                <w:color w:val="047857"/>
-                <w:sz w:val="19"/>
-              </w:rPr>
-              <w:t>5</w:t>
-            </w:r>
-          </w:p>
-        </w:tc>
-        <w:tc>
-          <w:tcPr>
-            <w:tcW w:type="dxa" w:w="3168"/>
-            <w:shd w:fill="FFFFFF"/>
-            <w:tcMar>
-              <w:top w:w="80" w:type="dxa"/>
-              <w:bottom w:w="80" w:type="dxa"/>
-              <w:left w:w="120" w:type="dxa"/>
-              <w:right w:w="120" w:type="dxa"/>
-            </w:tcMar>
-          </w:tcPr>
-          <w:p>
-            <w:pPr>
-              <w:spacing w:before="0" w:after="0"/>
-            </w:pPr>
-            <w:r>
-              <w:rPr>
-                <w:rFonts w:ascii="Arial" w:hAnsi="Arial"/>
-                <w:b/>
-                <w:color w:val="0F172A"/>
-                <w:sz w:val="19"/>
-              </w:rPr>
-              <w:t>Auto-Populated Form Inputs with Human Verification</w:t>
-            </w:r>
-          </w:p>
-        </w:tc>
-        <w:tc>
-          <w:tcPr>
-            <w:tcW w:type="dxa" w:w="5328"/>
-            <w:shd w:fill="FFFFFF"/>
-            <w:tcMar>
-              <w:top w:w="80" w:type="dxa"/>
-              <w:bottom w:w="80" w:type="dxa"/>
-              <w:left w:w="120" w:type="dxa"/>
-              <w:right w:w="120" w:type="dxa"/>
-            </w:tcMar>
-          </w:tcPr>
-          <w:p>
-            <w:pPr>
-              <w:spacing w:before="0" w:after="0" w:line="276" w:lineRule="auto"/>
-            </w:pPr>
-            <w:r>
-              <w:rPr>
-                <w:rFonts w:ascii="Arial" w:hAnsi="Arial"/>
-                <w:color w:val="334155"/>
-                <w:sz w:val="18"/>
-              </w:rPr>
-              <w:t>Auto-populated form fields allowing the official to perform human-in-the-loop review before saving.</w:t>
             </w:r>
           </w:p>
         </w:tc>
@@ -12799,7 +12639,7 @@
       <w:r>
         <w:drawing>
           <wp:inline xmlns:a="http://schemas.openxmlformats.org/drawingml/2006/main" xmlns:pic="http://schemas.openxmlformats.org/drawingml/2006/picture">
-            <wp:extent cx="5715000" cy="3571875"/>
+            <wp:extent cx="5715000" cy="3429000"/>
             <wp:docPr id="16" name="Picture 16"/>
             <wp:cNvGraphicFramePr>
               <a:graphicFrameLocks noChangeAspect="1"/>
@@ -12820,7 +12660,7 @@
                   <pic:spPr>
                     <a:xfrm>
                       <a:off x="0" y="0"/>
-                      <a:ext cx="5715000" cy="3571875"/>
+                      <a:ext cx="5715000" cy="3429000"/>
                     </a:xfrm>
                     <a:prstGeom prst="rect"/>
                   </pic:spPr>
@@ -13087,7 +12927,7 @@
                 <w:color w:val="0F172A"/>
                 <w:sz w:val="19"/>
               </w:rPr>
-              <w:t>Status Filter Chips (Lahat, Bago, Inaaksyunan, Naresolba)</w:t>
+              <w:t>Status Filter Tabs (Lahat, Bago, Inaaksyunan, Nalutas, Ibinasura)</w:t>
             </w:r>
           </w:p>
         </w:tc>
@@ -13112,7 +12952,7 @@
                 <w:color w:val="334155"/>
                 <w:sz w:val="18"/>
               </w:rPr>
-              <w:t>Status filter buttons (All, New, In Progress, Resolved) segregating reports by operational triage stage.</w:t>
+              <w:t>Status filter buttons (All, New, In Progress, Resolved, Dismissed) segregating reports by stage.</w:t>
             </w:r>
           </w:p>
         </w:tc>
@@ -13167,7 +13007,7 @@
                 <w:color w:val="0F172A"/>
                 <w:sz w:val="19"/>
               </w:rPr>
-              <w:t>Incident Report Record Row with Timestamp &amp; Category</w:t>
+              <w:t>Incident Reports Records Table</w:t>
             </w:r>
           </w:p>
         </w:tc>
@@ -13192,7 +13032,7 @@
                 <w:color w:val="334155"/>
                 <w:sz w:val="18"/>
               </w:rPr>
-              <w:t>Incident record row detailing category, landmark location, narrative summary, and submission timestamp.</w:t>
+              <w:t>Incident reports records table displaying violations, landmarks, reporters, and submission dates.</w:t>
             </w:r>
           </w:p>
         </w:tc>
@@ -13247,7 +13087,7 @@
                 <w:color w:val="0F172A"/>
                 <w:sz w:val="19"/>
               </w:rPr>
-              <w:t>Constituent Anonymity / Contact Verification Badge</w:t>
+              <w:t>Inline Status Triage &amp; Resolution Dropdown Control</w:t>
             </w:r>
           </w:p>
         </w:tc>
@@ -13272,87 +13112,7 @@
                 <w:color w:val="334155"/>
                 <w:sz w:val="18"/>
               </w:rPr>
-              <w:t>Resident confidentiality badge indicating whether the submission is anonymous or carries contact info.</w:t>
-            </w:r>
-          </w:p>
-        </w:tc>
-      </w:tr>
-      <w:tr>
-        <w:tc>
-          <w:tcPr>
-            <w:tcW w:type="dxa" w:w="864"/>
-            <w:shd w:fill="FFFFFF"/>
-            <w:tcMar>
-              <w:top w:w="80" w:type="dxa"/>
-              <w:bottom w:w="80" w:type="dxa"/>
-              <w:left w:w="120" w:type="dxa"/>
-              <w:right w:w="120" w:type="dxa"/>
-            </w:tcMar>
-          </w:tcPr>
-          <w:p>
-            <w:pPr>
-              <w:spacing w:before="0" w:after="0"/>
-              <w:jc w:val="center"/>
-            </w:pPr>
-            <w:r>
-              <w:rPr>
-                <w:rFonts w:ascii="Arial" w:hAnsi="Arial"/>
-                <w:b/>
-                <w:color w:val="047857"/>
-                <w:sz w:val="19"/>
-              </w:rPr>
-              <w:t>5</w:t>
-            </w:r>
-          </w:p>
-        </w:tc>
-        <w:tc>
-          <w:tcPr>
-            <w:tcW w:type="dxa" w:w="3168"/>
-            <w:shd w:fill="FFFFFF"/>
-            <w:tcMar>
-              <w:top w:w="80" w:type="dxa"/>
-              <w:bottom w:w="80" w:type="dxa"/>
-              <w:left w:w="120" w:type="dxa"/>
-              <w:right w:w="120" w:type="dxa"/>
-            </w:tcMar>
-          </w:tcPr>
-          <w:p>
-            <w:pPr>
-              <w:spacing w:before="0" w:after="0"/>
-            </w:pPr>
-            <w:r>
-              <w:rPr>
-                <w:rFonts w:ascii="Arial" w:hAnsi="Arial"/>
-                <w:b/>
-                <w:color w:val="0F172A"/>
-                <w:sz w:val="19"/>
-              </w:rPr>
-              <w:t>Triage &amp; Status Action Control</w:t>
-            </w:r>
-          </w:p>
-        </w:tc>
-        <w:tc>
-          <w:tcPr>
-            <w:tcW w:type="dxa" w:w="5328"/>
-            <w:shd w:fill="FFFFFF"/>
-            <w:tcMar>
-              <w:top w:w="80" w:type="dxa"/>
-              <w:bottom w:w="80" w:type="dxa"/>
-              <w:left w:w="120" w:type="dxa"/>
-              <w:right w:w="120" w:type="dxa"/>
-            </w:tcMar>
-          </w:tcPr>
-          <w:p>
-            <w:pPr>
-              <w:spacing w:before="0" w:after="0" w:line="276" w:lineRule="auto"/>
-            </w:pPr>
-            <w:r>
-              <w:rPr>
-                <w:rFonts w:ascii="Arial" w:hAnsi="Arial"/>
-                <w:color w:val="334155"/>
-                <w:sz w:val="18"/>
-              </w:rPr>
-              <w:t>Triage action button opening the case management dialog for status update and officer dispatch notes.</w:t>
+              <w:t>Inline status triage dropdown allowing immediate transition between New, In Progress, and Resolved.</w:t>
             </w:r>
           </w:p>
         </w:tc>
@@ -13476,7 +13236,7 @@
       <w:r>
         <w:drawing>
           <wp:inline xmlns:a="http://schemas.openxmlformats.org/drawingml/2006/main" xmlns:pic="http://schemas.openxmlformats.org/drawingml/2006/picture">
-            <wp:extent cx="5715000" cy="3571875"/>
+            <wp:extent cx="5715000" cy="3429000"/>
             <wp:docPr id="17" name="Picture 17"/>
             <wp:cNvGraphicFramePr>
               <a:graphicFrameLocks noChangeAspect="1"/>
@@ -13497,7 +13257,7 @@
                   <pic:spPr>
                     <a:xfrm>
                       <a:off x="0" y="0"/>
-                      <a:ext cx="5715000" cy="3571875"/>
+                      <a:ext cx="5715000" cy="3429000"/>
                     </a:xfrm>
                     <a:prstGeom prst="rect"/>
                   </pic:spPr>
@@ -13684,7 +13444,7 @@
                 <w:color w:val="0F172A"/>
                 <w:sz w:val="19"/>
               </w:rPr>
-              <w:t>Incident Case Triage Dialog Header</w:t>
+              <w:t>Target Incident Report Record Row</w:t>
             </w:r>
           </w:p>
         </w:tc>
@@ -13709,7 +13469,7 @@
                 <w:color w:val="334155"/>
                 <w:sz w:val="18"/>
               </w:rPr>
-              <w:t>Incident case overview modal displaying full resident testimony and timestamped submission details.</w:t>
+              <w:t>Focused incident report record row selected for investigation and administrative status update.</w:t>
             </w:r>
           </w:p>
         </w:tc>
@@ -13764,7 +13524,7 @@
                 <w:color w:val="0F172A"/>
                 <w:sz w:val="19"/>
               </w:rPr>
-              <w:t>Constituent Incident Details &amp; Evidence Overview</w:t>
+              <w:t>Incident Classification Badge</w:t>
             </w:r>
           </w:p>
         </w:tc>
@@ -13789,7 +13549,7 @@
                 <w:color w:val="334155"/>
                 <w:sz w:val="18"/>
               </w:rPr>
-              <w:t>Incident evidence review area allowing inspection of citizen descriptions and uploaded photo proofs.</w:t>
+              <w:t>Violation category badge classifying the complaint (Trash Burning, Noise, Road Obstruction).</w:t>
             </w:r>
           </w:p>
         </w:tc>
@@ -13844,7 +13604,7 @@
                 <w:color w:val="0F172A"/>
                 <w:sz w:val="19"/>
               </w:rPr>
-              <w:t>Resolution Status Selector (Bago -&gt; Inaaksyunan -&gt; Naresolba)</w:t>
+              <w:t>Reporter Information &amp; Anonymity Verification</w:t>
             </w:r>
           </w:p>
         </w:tc>
@@ -13869,7 +13629,7 @@
                 <w:color w:val="334155"/>
                 <w:sz w:val="18"/>
               </w:rPr>
-              <w:t>Operational status selector transitioning cases from 'New' to 'In Progress' and finally 'Resolved'.</w:t>
+              <w:t>Reporter identification and contact details verification cell (with anonymous flag protection).</w:t>
             </w:r>
           </w:p>
         </w:tc>
@@ -13924,7 +13684,7 @@
                 <w:color w:val="0F172A"/>
                 <w:sz w:val="19"/>
               </w:rPr>
-              <w:t>Barangay Official Action Remarks &amp; Findings Field</w:t>
+              <w:t>Current Report Life-Cycle Status Badge</w:t>
             </w:r>
           </w:p>
         </w:tc>
@@ -13949,7 +13709,7 @@
                 <w:color w:val="334155"/>
                 <w:sz w:val="18"/>
               </w:rPr>
-              <w:t>Action remarks textarea where officials document barangay tanod dispatch and resolution measures taken.</w:t>
+              <w:t>Current life-cycle status badge reflecting real-time handling status in the central database.</w:t>
             </w:r>
           </w:p>
         </w:tc>
@@ -14004,7 +13764,7 @@
                 <w:color w:val="0F172A"/>
                 <w:sz w:val="19"/>
               </w:rPr>
-              <w:t>Confirm Status Update Action Button</w:t>
+              <w:t>Official Status Mutation &amp; Triage Dropdown Selector</w:t>
             </w:r>
           </w:p>
         </w:tc>
@@ -14029,7 +13789,7 @@
                 <w:color w:val="334155"/>
                 <w:sz w:val="18"/>
               </w:rPr>
-              <w:t>Confirmation button committing status updates, creating an audit log, and notifying the resident.</w:t>
+              <w:t>Administrative status mutation dropdown enabling officials to record action and resolve complaints.</w:t>
             </w:r>
           </w:p>
         </w:tc>
@@ -14153,7 +13913,7 @@
       <w:r>
         <w:drawing>
           <wp:inline xmlns:a="http://schemas.openxmlformats.org/drawingml/2006/main" xmlns:pic="http://schemas.openxmlformats.org/drawingml/2006/picture">
-            <wp:extent cx="5715000" cy="3571875"/>
+            <wp:extent cx="5715000" cy="3429000"/>
             <wp:docPr id="18" name="Picture 18"/>
             <wp:cNvGraphicFramePr>
               <a:graphicFrameLocks noChangeAspect="1"/>
@@ -14174,7 +13934,7 @@
                   <pic:spPr>
                     <a:xfrm>
                       <a:off x="0" y="0"/>
-                      <a:ext cx="5715000" cy="3571875"/>
+                      <a:ext cx="5715000" cy="3429000"/>
                     </a:xfrm>
                     <a:prstGeom prst="rect"/>
                   </pic:spPr>
@@ -14441,7 +14201,7 @@
                 <w:color w:val="0F172A"/>
                 <w:sz w:val="19"/>
               </w:rPr>
-              <w:t>Report Criteria &amp; Category Selector</w:t>
+              <w:t>Report Type Structure Selector Card</w:t>
             </w:r>
           </w:p>
         </w:tc>
@@ -14521,7 +14281,7 @@
                 <w:color w:val="0F172A"/>
                 <w:sz w:val="19"/>
               </w:rPr>
-              <w:t>Generate Localized Report Button</w:t>
+              <w:t>Multi-Criteria Filter Parameters Panel</w:t>
             </w:r>
           </w:p>
         </w:tc>
@@ -14546,7 +14306,7 @@
                 <w:color w:val="334155"/>
                 <w:sz w:val="18"/>
               </w:rPr>
-              <w:t>Execution trigger generating certified legislative summaries for local archiving and review.</w:t>
+              <w:t>Multi-criteria filter panel with dropdowns for year series, status, category, and barangay scoping.</w:t>
             </w:r>
           </w:p>
         </w:tc>
@@ -14601,7 +14361,7 @@
                 <w:color w:val="0F172A"/>
                 <w:sz w:val="19"/>
               </w:rPr>
-              <w:t>Official Export &amp; PDF Download Toolbar</w:t>
+              <w:t>Generate Localized Report Action Button</w:t>
             </w:r>
           </w:p>
         </w:tc>
@@ -14804,7 +14564,7 @@
       <w:r>
         <w:drawing>
           <wp:inline xmlns:a="http://schemas.openxmlformats.org/drawingml/2006/main" xmlns:pic="http://schemas.openxmlformats.org/drawingml/2006/picture">
-            <wp:extent cx="5715000" cy="3571875"/>
+            <wp:extent cx="5715000" cy="3429000"/>
             <wp:docPr id="19" name="Picture 19"/>
             <wp:cNvGraphicFramePr>
               <a:graphicFrameLocks noChangeAspect="1"/>
@@ -14825,7 +14585,7 @@
                   <pic:spPr>
                     <a:xfrm>
                       <a:off x="0" y="0"/>
-                      <a:ext cx="5715000" cy="3571875"/>
+                      <a:ext cx="5715000" cy="3429000"/>
                     </a:xfrm>
                     <a:prstGeom prst="rect"/>
                   </pic:spPr>
@@ -15172,7 +14932,7 @@
                 <w:color w:val="0F172A"/>
                 <w:sz w:val="19"/>
               </w:rPr>
-              <w:t>Quick Governance Action Shortcuts (Add Ordinance, Export, Reviews)</w:t>
+              <w:t>Ordinance Status Life-Cycle Summary Grid</w:t>
             </w:r>
           </w:p>
         </w:tc>
@@ -15504,7 +15264,7 @@
       <w:r>
         <w:drawing>
           <wp:inline xmlns:a="http://schemas.openxmlformats.org/drawingml/2006/main" xmlns:pic="http://schemas.openxmlformats.org/drawingml/2006/picture">
-            <wp:extent cx="5715000" cy="3571875"/>
+            <wp:extent cx="5715000" cy="3429000"/>
             <wp:docPr id="20" name="Picture 20"/>
             <wp:cNvGraphicFramePr>
               <a:graphicFrameLocks noChangeAspect="1"/>
@@ -15525,7 +15285,7 @@
                   <pic:spPr>
                     <a:xfrm>
                       <a:off x="0" y="0"/>
-                      <a:ext cx="5715000" cy="3571875"/>
+                      <a:ext cx="5715000" cy="3429000"/>
                     </a:xfrm>
                     <a:prstGeom prst="rect"/>
                   </pic:spPr>
@@ -15792,7 +15552,7 @@
                 <w:color w:val="0F172A"/>
                 <w:sz w:val="19"/>
               </w:rPr>
-              <w:t>Instant City Ordinance Repository Search Input</w:t>
+              <w:t>Add City Ordinance Action Button ('+ Bagong City Ordinance')</w:t>
             </w:r>
           </w:p>
         </w:tc>
@@ -15817,7 +15577,7 @@
                 <w:color w:val="334155"/>
                 <w:sz w:val="18"/>
               </w:rPr>
-              <w:t>Client-side instant search input filtering city and barangay ordinances without network latency.</w:t>
+              <w:t>New Ordinance enactment button launching the City Hall legislative creation and AI extraction modal.</w:t>
             </w:r>
           </w:p>
         </w:tc>
@@ -15872,7 +15632,7 @@
                 <w:color w:val="0F172A"/>
                 <w:sz w:val="19"/>
               </w:rPr>
-              <w:t>Add City Ordinance / AI Document Parsing Action Button</w:t>
+              <w:t>Instant City Ordinance Repository Search Input</w:t>
             </w:r>
           </w:p>
         </w:tc>
@@ -15897,7 +15657,7 @@
                 <w:color w:val="334155"/>
                 <w:sz w:val="18"/>
               </w:rPr>
-              <w:t>New Ordinance enactment button launching the City Hall legislative creation and AI extraction modal.</w:t>
+              <w:t>Client-side instant search input filtering city and barangay ordinances without network latency.</w:t>
             </w:r>
           </w:p>
         </w:tc>
@@ -15978,86 +15738,6 @@
                 <w:sz w:val="18"/>
               </w:rPr>
               <w:t>Consolidated repository table with jurisdiction badges distinguishing City vs Barangay resolutions.</w:t>
-            </w:r>
-          </w:p>
-        </w:tc>
-      </w:tr>
-      <w:tr>
-        <w:tc>
-          <w:tcPr>
-            <w:tcW w:type="dxa" w:w="864"/>
-            <w:shd w:fill="FFFFFF"/>
-            <w:tcMar>
-              <w:top w:w="80" w:type="dxa"/>
-              <w:bottom w:w="80" w:type="dxa"/>
-              <w:left w:w="120" w:type="dxa"/>
-              <w:right w:w="120" w:type="dxa"/>
-            </w:tcMar>
-          </w:tcPr>
-          <w:p>
-            <w:pPr>
-              <w:spacing w:before="0" w:after="0"/>
-              <w:jc w:val="center"/>
-            </w:pPr>
-            <w:r>
-              <w:rPr>
-                <w:rFonts w:ascii="Arial" w:hAnsi="Arial"/>
-                <w:b/>
-                <w:color w:val="047857"/>
-                <w:sz w:val="19"/>
-              </w:rPr>
-              <w:t>5</w:t>
-            </w:r>
-          </w:p>
-        </w:tc>
-        <w:tc>
-          <w:tcPr>
-            <w:tcW w:type="dxa" w:w="3168"/>
-            <w:shd w:fill="FFFFFF"/>
-            <w:tcMar>
-              <w:top w:w="80" w:type="dxa"/>
-              <w:bottom w:w="80" w:type="dxa"/>
-              <w:left w:w="120" w:type="dxa"/>
-              <w:right w:w="120" w:type="dxa"/>
-            </w:tcMar>
-          </w:tcPr>
-          <w:p>
-            <w:pPr>
-              <w:spacing w:before="0" w:after="0"/>
-            </w:pPr>
-            <w:r>
-              <w:rPr>
-                <w:rFonts w:ascii="Arial" w:hAnsi="Arial"/>
-                <w:b/>
-                <w:color w:val="0F172A"/>
-                <w:sz w:val="19"/>
-              </w:rPr>
-              <w:t>Legislative Oversight Action Controls (Review, Enact, Delete)</w:t>
-            </w:r>
-          </w:p>
-        </w:tc>
-        <w:tc>
-          <w:tcPr>
-            <w:tcW w:type="dxa" w:w="5328"/>
-            <w:shd w:fill="FFFFFF"/>
-            <w:tcMar>
-              <w:top w:w="80" w:type="dxa"/>
-              <w:bottom w:w="80" w:type="dxa"/>
-              <w:left w:w="120" w:type="dxa"/>
-              <w:right w:w="120" w:type="dxa"/>
-            </w:tcMar>
-          </w:tcPr>
-          <w:p>
-            <w:pPr>
-              <w:spacing w:before="0" w:after="0" w:line="276" w:lineRule="auto"/>
-            </w:pPr>
-            <w:r>
-              <w:rPr>
-                <w:rFonts w:ascii="Arial" w:hAnsi="Arial"/>
-                <w:color w:val="334155"/>
-                <w:sz w:val="18"/>
-              </w:rPr>
-              <w:t>Administrative actions column providing review triggers, status overrides, and deletion safeguards.</w:t>
             </w:r>
           </w:p>
         </w:tc>
@@ -16227,7 +15907,7 @@
       <w:r>
         <w:drawing>
           <wp:inline xmlns:a="http://schemas.openxmlformats.org/drawingml/2006/main" xmlns:pic="http://schemas.openxmlformats.org/drawingml/2006/picture">
-            <wp:extent cx="5715000" cy="3571875"/>
+            <wp:extent cx="5715000" cy="3429000"/>
             <wp:docPr id="21" name="Picture 21"/>
             <wp:cNvGraphicFramePr>
               <a:graphicFrameLocks noChangeAspect="1"/>
@@ -16248,7 +15928,7 @@
                   <pic:spPr>
                     <a:xfrm>
                       <a:off x="0" y="0"/>
-                      <a:ext cx="5715000" cy="3571875"/>
+                      <a:ext cx="5715000" cy="3429000"/>
                     </a:xfrm>
                     <a:prstGeom prst="rect"/>
                   </pic:spPr>
@@ -16435,7 +16115,7 @@
                 <w:color w:val="0F172A"/>
                 <w:sz w:val="19"/>
               </w:rPr>
-              <w:t>Sangguniang Panlungsod Legislative Review Dialog Header</w:t>
+              <w:t>Sangguniang Panlungsod Legislative Approval Dialog Header</w:t>
             </w:r>
           </w:p>
         </w:tc>
@@ -16515,7 +16195,7 @@
                 <w:color w:val="0F172A"/>
                 <w:sz w:val="19"/>
               </w:rPr>
-              <w:t>Barangay Proposal Summary &amp; Enactment Metadata</w:t>
+              <w:t>Pending Ordinance Title &amp; Legal Enactment Notice</w:t>
             </w:r>
           </w:p>
         </w:tc>
@@ -16540,7 +16220,7 @@
                 <w:color w:val="334155"/>
                 <w:sz w:val="18"/>
               </w:rPr>
-              <w:t>Barangay transmittal overview showing proposed resolution provisions, penalties, and signatories.</w:t>
+              <w:t>Legal enactment confirmation notice asking the administrator to verify statutory compliance.</w:t>
             </w:r>
           </w:p>
         </w:tc>
@@ -16595,7 +16275,7 @@
                 <w:color w:val="0F172A"/>
                 <w:sz w:val="19"/>
               </w:rPr>
-              <w:t>City Legal Review Comments &amp; Observation Remarks</w:t>
+              <w:t>Official Enactment / Approval Action Button ('Aprubahan')</w:t>
             </w:r>
           </w:p>
         </w:tc>
@@ -16620,7 +16300,7 @@
                 <w:color w:val="334155"/>
                 <w:sz w:val="18"/>
               </w:rPr>
-              <w:t>City Legal Council observations and review remarks input field for formal feedback transmission.</w:t>
+              <w:t>Official enactment approval button updating status to APPROVED and publishing to the public portal.</w:t>
             </w:r>
           </w:p>
         </w:tc>
@@ -16675,7 +16355,7 @@
                 <w:color w:val="0F172A"/>
                 <w:sz w:val="19"/>
               </w:rPr>
-              <w:t>Official Enactment / Approval Action Button ('Aprubahan')</w:t>
+              <w:t>Dismiss Review / Return Button ('Bumalik')</w:t>
             </w:r>
           </w:p>
         </w:tc>
@@ -16700,87 +16380,7 @@
                 <w:color w:val="334155"/>
                 <w:sz w:val="18"/>
               </w:rPr>
-              <w:t>Approval action button updating record status to 'APPROVED' and immediately publishing to the public.</w:t>
-            </w:r>
-          </w:p>
-        </w:tc>
-      </w:tr>
-      <w:tr>
-        <w:tc>
-          <w:tcPr>
-            <w:tcW w:type="dxa" w:w="864"/>
-            <w:shd w:fill="FFFFFF"/>
-            <w:tcMar>
-              <w:top w:w="80" w:type="dxa"/>
-              <w:bottom w:w="80" w:type="dxa"/>
-              <w:left w:w="120" w:type="dxa"/>
-              <w:right w:w="120" w:type="dxa"/>
-            </w:tcMar>
-          </w:tcPr>
-          <w:p>
-            <w:pPr>
-              <w:spacing w:before="0" w:after="0"/>
-              <w:jc w:val="center"/>
-            </w:pPr>
-            <w:r>
-              <w:rPr>
-                <w:rFonts w:ascii="Arial" w:hAnsi="Arial"/>
-                <w:b/>
-                <w:color w:val="047857"/>
-                <w:sz w:val="19"/>
-              </w:rPr>
-              <w:t>5</w:t>
-            </w:r>
-          </w:p>
-        </w:tc>
-        <w:tc>
-          <w:tcPr>
-            <w:tcW w:type="dxa" w:w="3168"/>
-            <w:shd w:fill="FFFFFF"/>
-            <w:tcMar>
-              <w:top w:w="80" w:type="dxa"/>
-              <w:bottom w:w="80" w:type="dxa"/>
-              <w:left w:w="120" w:type="dxa"/>
-              <w:right w:w="120" w:type="dxa"/>
-            </w:tcMar>
-          </w:tcPr>
-          <w:p>
-            <w:pPr>
-              <w:spacing w:before="0" w:after="0"/>
-            </w:pPr>
-            <w:r>
-              <w:rPr>
-                <w:rFonts w:ascii="Arial" w:hAnsi="Arial"/>
-                <w:b/>
-                <w:color w:val="0F172A"/>
-                <w:sz w:val="19"/>
-              </w:rPr>
-              <w:t>Request Revision / Deny Submission Button ('Tanggihan')</w:t>
-            </w:r>
-          </w:p>
-        </w:tc>
-        <w:tc>
-          <w:tcPr>
-            <w:tcW w:type="dxa" w:w="5328"/>
-            <w:shd w:fill="FFFFFF"/>
-            <w:tcMar>
-              <w:top w:w="80" w:type="dxa"/>
-              <w:bottom w:w="80" w:type="dxa"/>
-              <w:left w:w="120" w:type="dxa"/>
-              <w:right w:w="120" w:type="dxa"/>
-            </w:tcMar>
-          </w:tcPr>
-          <w:p>
-            <w:pPr>
-              <w:spacing w:before="0" w:after="0" w:line="276" w:lineRule="auto"/>
-            </w:pPr>
-            <w:r>
-              <w:rPr>
-                <w:rFonts w:ascii="Arial" w:hAnsi="Arial"/>
-                <w:color w:val="334155"/>
-                <w:sz w:val="18"/>
-              </w:rPr>
-              <w:t>Revision / Rejection action button returning proposal to the barangay with attached corrective guidance.</w:t>
+              <w:t>Cancel / dismiss action button returning to the pending list without altering ordinance status.</w:t>
             </w:r>
           </w:p>
         </w:tc>
@@ -16927,7 +16527,7 @@
       <w:r>
         <w:drawing>
           <wp:inline xmlns:a="http://schemas.openxmlformats.org/drawingml/2006/main" xmlns:pic="http://schemas.openxmlformats.org/drawingml/2006/picture">
-            <wp:extent cx="5715000" cy="3571875"/>
+            <wp:extent cx="5715000" cy="3429000"/>
             <wp:docPr id="22" name="Picture 22"/>
             <wp:cNvGraphicFramePr>
               <a:graphicFrameLocks noChangeAspect="1"/>
@@ -16948,7 +16548,7 @@
                   <pic:spPr>
                     <a:xfrm>
                       <a:off x="0" y="0"/>
-                      <a:ext cx="5715000" cy="3571875"/>
+                      <a:ext cx="5715000" cy="3429000"/>
                     </a:xfrm>
                     <a:prstGeom prst="rect"/>
                   </pic:spPr>
@@ -17321,166 +16921,6 @@
                 <w:sz w:val="18"/>
               </w:rPr>
               <w:t>AI extraction execution trigger initiating automated OCR, preamble stripping, and penalty categorization.</w:t>
-            </w:r>
-          </w:p>
-        </w:tc>
-      </w:tr>
-      <w:tr>
-        <w:tc>
-          <w:tcPr>
-            <w:tcW w:type="dxa" w:w="864"/>
-            <w:shd w:fill="F8FAFC"/>
-            <w:tcMar>
-              <w:top w:w="80" w:type="dxa"/>
-              <w:bottom w:w="80" w:type="dxa"/>
-              <w:left w:w="120" w:type="dxa"/>
-              <w:right w:w="120" w:type="dxa"/>
-            </w:tcMar>
-          </w:tcPr>
-          <w:p>
-            <w:pPr>
-              <w:spacing w:before="0" w:after="0"/>
-              <w:jc w:val="center"/>
-            </w:pPr>
-            <w:r>
-              <w:rPr>
-                <w:rFonts w:ascii="Arial" w:hAnsi="Arial"/>
-                <w:b/>
-                <w:color w:val="047857"/>
-                <w:sz w:val="19"/>
-              </w:rPr>
-              <w:t>4</w:t>
-            </w:r>
-          </w:p>
-        </w:tc>
-        <w:tc>
-          <w:tcPr>
-            <w:tcW w:type="dxa" w:w="3168"/>
-            <w:shd w:fill="F8FAFC"/>
-            <w:tcMar>
-              <w:top w:w="80" w:type="dxa"/>
-              <w:bottom w:w="80" w:type="dxa"/>
-              <w:left w:w="120" w:type="dxa"/>
-              <w:right w:w="120" w:type="dxa"/>
-            </w:tcMar>
-          </w:tcPr>
-          <w:p>
-            <w:pPr>
-              <w:spacing w:before="0" w:after="0"/>
-            </w:pPr>
-            <w:r>
-              <w:rPr>
-                <w:rFonts w:ascii="Arial" w:hAnsi="Arial"/>
-                <w:b/>
-                <w:color w:val="0F172A"/>
-                <w:sz w:val="19"/>
-              </w:rPr>
-              <w:t>Auto-Populated Resolution Number, Series &amp; Enactment Date</w:t>
-            </w:r>
-          </w:p>
-        </w:tc>
-        <w:tc>
-          <w:tcPr>
-            <w:tcW w:type="dxa" w:w="5328"/>
-            <w:shd w:fill="F8FAFC"/>
-            <w:tcMar>
-              <w:top w:w="80" w:type="dxa"/>
-              <w:bottom w:w="80" w:type="dxa"/>
-              <w:left w:w="120" w:type="dxa"/>
-              <w:right w:w="120" w:type="dxa"/>
-            </w:tcMar>
-          </w:tcPr>
-          <w:p>
-            <w:pPr>
-              <w:spacing w:before="0" w:after="0" w:line="276" w:lineRule="auto"/>
-            </w:pPr>
-            <w:r>
-              <w:rPr>
-                <w:rFonts w:ascii="Arial" w:hAnsi="Arial"/>
-                <w:color w:val="334155"/>
-                <w:sz w:val="18"/>
-              </w:rPr>
-              <w:t>Auto-populated legislative fields displaying parsed resolution number, year series, and cleaned title.</w:t>
-            </w:r>
-          </w:p>
-        </w:tc>
-      </w:tr>
-      <w:tr>
-        <w:tc>
-          <w:tcPr>
-            <w:tcW w:type="dxa" w:w="864"/>
-            <w:shd w:fill="FFFFFF"/>
-            <w:tcMar>
-              <w:top w:w="80" w:type="dxa"/>
-              <w:bottom w:w="80" w:type="dxa"/>
-              <w:left w:w="120" w:type="dxa"/>
-              <w:right w:w="120" w:type="dxa"/>
-            </w:tcMar>
-          </w:tcPr>
-          <w:p>
-            <w:pPr>
-              <w:spacing w:before="0" w:after="0"/>
-              <w:jc w:val="center"/>
-            </w:pPr>
-            <w:r>
-              <w:rPr>
-                <w:rFonts w:ascii="Arial" w:hAnsi="Arial"/>
-                <w:b/>
-                <w:color w:val="047857"/>
-                <w:sz w:val="19"/>
-              </w:rPr>
-              <w:t>5</w:t>
-            </w:r>
-          </w:p>
-        </w:tc>
-        <w:tc>
-          <w:tcPr>
-            <w:tcW w:type="dxa" w:w="3168"/>
-            <w:shd w:fill="FFFFFF"/>
-            <w:tcMar>
-              <w:top w:w="80" w:type="dxa"/>
-              <w:bottom w:w="80" w:type="dxa"/>
-              <w:left w:w="120" w:type="dxa"/>
-              <w:right w:w="120" w:type="dxa"/>
-            </w:tcMar>
-          </w:tcPr>
-          <w:p>
-            <w:pPr>
-              <w:spacing w:before="0" w:after="0"/>
-            </w:pPr>
-            <w:r>
-              <w:rPr>
-                <w:rFonts w:ascii="Arial" w:hAnsi="Arial"/>
-                <w:b/>
-                <w:color w:val="0F172A"/>
-                <w:sz w:val="19"/>
-              </w:rPr>
-              <w:t>Auto-Extracted Tiered Sanctions &amp; Fines Breakdown</w:t>
-            </w:r>
-          </w:p>
-        </w:tc>
-        <w:tc>
-          <w:tcPr>
-            <w:tcW w:type="dxa" w:w="5328"/>
-            <w:shd w:fill="FFFFFF"/>
-            <w:tcMar>
-              <w:top w:w="80" w:type="dxa"/>
-              <w:bottom w:w="80" w:type="dxa"/>
-              <w:left w:w="120" w:type="dxa"/>
-              <w:right w:w="120" w:type="dxa"/>
-            </w:tcMar>
-          </w:tcPr>
-          <w:p>
-            <w:pPr>
-              <w:spacing w:before="0" w:after="0" w:line="276" w:lineRule="auto"/>
-            </w:pPr>
-            <w:r>
-              <w:rPr>
-                <w:rFonts w:ascii="Arial" w:hAnsi="Arial"/>
-                <w:color w:val="334155"/>
-                <w:sz w:val="18"/>
-              </w:rPr>
-              <w:t>Structured sanctions editor displaying parsed first, second, and third offense fine schedules.</w:t>
             </w:r>
           </w:p>
         </w:tc>
@@ -17604,7 +17044,7 @@
       <w:r>
         <w:drawing>
           <wp:inline xmlns:a="http://schemas.openxmlformats.org/drawingml/2006/main" xmlns:pic="http://schemas.openxmlformats.org/drawingml/2006/picture">
-            <wp:extent cx="5715000" cy="3571875"/>
+            <wp:extent cx="5715000" cy="3429000"/>
             <wp:docPr id="23" name="Picture 23"/>
             <wp:cNvGraphicFramePr>
               <a:graphicFrameLocks noChangeAspect="1"/>
@@ -17625,7 +17065,7 @@
                   <pic:spPr>
                     <a:xfrm>
                       <a:off x="0" y="0"/>
-                      <a:ext cx="5715000" cy="3571875"/>
+                      <a:ext cx="5715000" cy="3429000"/>
                     </a:xfrm>
                     <a:prstGeom prst="rect"/>
                   </pic:spPr>
@@ -17892,7 +17332,7 @@
                 <w:color w:val="0F172A"/>
                 <w:sz w:val="19"/>
               </w:rPr>
-              <w:t>Register New Official Action Button ('Magrehistro ng Opisyal')</w:t>
+              <w:t>Register New Official Action Button ('Magdagdag ng Opisyal')</w:t>
             </w:r>
           </w:p>
         </w:tc>
@@ -18281,7 +17721,7 @@
       <w:r>
         <w:drawing>
           <wp:inline xmlns:a="http://schemas.openxmlformats.org/drawingml/2006/main" xmlns:pic="http://schemas.openxmlformats.org/drawingml/2006/picture">
-            <wp:extent cx="5715000" cy="3571875"/>
+            <wp:extent cx="5715000" cy="3429000"/>
             <wp:docPr id="24" name="Picture 24"/>
             <wp:cNvGraphicFramePr>
               <a:graphicFrameLocks noChangeAspect="1"/>
@@ -18302,7 +17742,7 @@
                   <pic:spPr>
                     <a:xfrm>
                       <a:off x="0" y="0"/>
-                      <a:ext cx="5715000" cy="3571875"/>
+                      <a:ext cx="5715000" cy="3429000"/>
                     </a:xfrm>
                     <a:prstGeom prst="rect"/>
                   </pic:spPr>
@@ -18514,7 +17954,7 @@
                 <w:color w:val="334155"/>
                 <w:sz w:val="18"/>
               </w:rPr>
-              <w:t>Cabanatuan City Barangay Directory header tracking administrative coverage across all eighty-nine barangays.</w:t>
+              <w:t>Cabanatuan City Barangay Directory header tracking administrative coverage across all 89 barangays.</w:t>
             </w:r>
           </w:p>
         </w:tc>
@@ -18569,7 +18009,7 @@
                 <w:color w:val="0F172A"/>
                 <w:sz w:val="19"/>
               </w:rPr>
-              <w:t>Active Participation &amp; Onboarding Indicators</w:t>
+              <w:t>Barangay Participation &amp; Onboarding Indicators</w:t>
             </w:r>
           </w:p>
         </w:tc>
@@ -18594,7 +18034,7 @@
                 <w:color w:val="334155"/>
                 <w:sz w:val="18"/>
               </w:rPr>
-              <w:t>Active portal participation indicator cards distinguishing active pilot barangays from pending ones.</w:t>
+              <w:t>Participation and coverage statistics banner displaying total barangays and active admin accounts.</w:t>
             </w:r>
           </w:p>
         </w:tc>
@@ -18649,7 +18089,7 @@
                 <w:color w:val="0F172A"/>
                 <w:sz w:val="19"/>
               </w:rPr>
-              <w:t>Registered Barangay Directory Cards with Ordinance Counters</w:t>
+              <w:t>Barangay Search &amp; Filter Input Field</w:t>
             </w:r>
           </w:p>
         </w:tc>
@@ -18674,7 +18114,7 @@
                 <w:color w:val="334155"/>
                 <w:sz w:val="18"/>
               </w:rPr>
-              <w:t>Barangay card grid displaying registered barangays with active local ordinance counts.</w:t>
+              <w:t>Barangay search input field allowing instant lookup by barangay name or captain email address.</w:t>
             </w:r>
           </w:p>
         </w:tc>
@@ -18729,7 +18169,7 @@
                 <w:color w:val="0F172A"/>
                 <w:sz w:val="19"/>
               </w:rPr>
-              <w:t>Local Jurisdiction Contact &amp; Profile Shortcuts</w:t>
+              <w:t>Register New Barangay Action Button</w:t>
             </w:r>
           </w:p>
         </w:tc>
@@ -18754,7 +18194,87 @@
                 <w:color w:val="334155"/>
                 <w:sz w:val="18"/>
               </w:rPr>
-              <w:t>Direct navigation shortcuts for inspecting localized legislative archives for specific barangays.</w:t>
+              <w:t>Primary registration button launching the new barangay creation and official account setup modal.</w:t>
+            </w:r>
+          </w:p>
+        </w:tc>
+      </w:tr>
+      <w:tr>
+        <w:tc>
+          <w:tcPr>
+            <w:tcW w:type="dxa" w:w="864"/>
+            <w:shd w:fill="FFFFFF"/>
+            <w:tcMar>
+              <w:top w:w="80" w:type="dxa"/>
+              <w:bottom w:w="80" w:type="dxa"/>
+              <w:left w:w="120" w:type="dxa"/>
+              <w:right w:w="120" w:type="dxa"/>
+            </w:tcMar>
+          </w:tcPr>
+          <w:p>
+            <w:pPr>
+              <w:spacing w:before="0" w:after="0"/>
+              <w:jc w:val="center"/>
+            </w:pPr>
+            <w:r>
+              <w:rPr>
+                <w:rFonts w:ascii="Arial" w:hAnsi="Arial"/>
+                <w:b/>
+                <w:color w:val="047857"/>
+                <w:sz w:val="19"/>
+              </w:rPr>
+              <w:t>5</w:t>
+            </w:r>
+          </w:p>
+        </w:tc>
+        <w:tc>
+          <w:tcPr>
+            <w:tcW w:type="dxa" w:w="3168"/>
+            <w:shd w:fill="FFFFFF"/>
+            <w:tcMar>
+              <w:top w:w="80" w:type="dxa"/>
+              <w:bottom w:w="80" w:type="dxa"/>
+              <w:left w:w="120" w:type="dxa"/>
+              <w:right w:w="120" w:type="dxa"/>
+            </w:tcMar>
+          </w:tcPr>
+          <w:p>
+            <w:pPr>
+              <w:spacing w:before="0" w:after="0"/>
+            </w:pPr>
+            <w:r>
+              <w:rPr>
+                <w:rFonts w:ascii="Arial" w:hAnsi="Arial"/>
+                <w:b/>
+                <w:color w:val="0F172A"/>
+                <w:sz w:val="19"/>
+              </w:rPr>
+              <w:t>Barangay Directory Table with Ordinance &amp; Report Counts</w:t>
+            </w:r>
+          </w:p>
+        </w:tc>
+        <w:tc>
+          <w:tcPr>
+            <w:tcW w:type="dxa" w:w="5328"/>
+            <w:shd w:fill="FFFFFF"/>
+            <w:tcMar>
+              <w:top w:w="80" w:type="dxa"/>
+              <w:bottom w:w="80" w:type="dxa"/>
+              <w:left w:w="120" w:type="dxa"/>
+              <w:right w:w="120" w:type="dxa"/>
+            </w:tcMar>
+          </w:tcPr>
+          <w:p>
+            <w:pPr>
+              <w:spacing w:before="0" w:after="0" w:line="276" w:lineRule="auto"/>
+            </w:pPr>
+            <w:r>
+              <w:rPr>
+                <w:rFonts w:ascii="Arial" w:hAnsi="Arial"/>
+                <w:color w:val="334155"/>
+                <w:sz w:val="18"/>
+              </w:rPr>
+              <w:t>Consolidated directory records table displaying enacted local ordinances and resident report tallies.</w:t>
             </w:r>
           </w:p>
         </w:tc>
@@ -18901,7 +18421,7 @@
       <w:r>
         <w:drawing>
           <wp:inline xmlns:a="http://schemas.openxmlformats.org/drawingml/2006/main" xmlns:pic="http://schemas.openxmlformats.org/drawingml/2006/picture">
-            <wp:extent cx="5715000" cy="3571875"/>
+            <wp:extent cx="5715000" cy="3429000"/>
             <wp:docPr id="25" name="Picture 25"/>
             <wp:cNvGraphicFramePr>
               <a:graphicFrameLocks noChangeAspect="1"/>
@@ -18922,7 +18442,7 @@
                   <pic:spPr>
                     <a:xfrm>
                       <a:off x="0" y="0"/>
-                      <a:ext cx="5715000" cy="3571875"/>
+                      <a:ext cx="5715000" cy="3429000"/>
                     </a:xfrm>
                     <a:prstGeom prst="rect"/>
                   </pic:spPr>
@@ -19189,7 +18709,7 @@
                 <w:color w:val="0F172A"/>
                 <w:sz w:val="19"/>
               </w:rPr>
-              <w:t>Territorial Barangay Filter Dropdown (All 89 Barangays)</w:t>
+              <w:t>Resolution Status Filter Tabs (Lahat, Bago, Inaaksyunan, Nalutas, Ibinasura)</w:t>
             </w:r>
           </w:p>
         </w:tc>
@@ -19214,7 +18734,7 @@
                 <w:color w:val="334155"/>
                 <w:sz w:val="18"/>
               </w:rPr>
-              <w:t>Territorial barangay dropdown filter allowing city administrators to inspect any of the 89 barangays.</w:t>
+              <w:t>Consolidated status tabs segregating reports across New, In Progress, Resolved, and Dismissed stages.</w:t>
             </w:r>
           </w:p>
         </w:tc>
@@ -19269,7 +18789,7 @@
                 <w:color w:val="0F172A"/>
                 <w:sz w:val="19"/>
               </w:rPr>
-              <w:t>Resolution Status Filter Tabs (Lahat, Bago, Inaaksyunan, Naresolba)</w:t>
+              <w:t>Consolidated City-Wide Incident Records Table</w:t>
             </w:r>
           </w:p>
         </w:tc>
@@ -19294,7 +18814,7 @@
                 <w:color w:val="334155"/>
                 <w:sz w:val="18"/>
               </w:rPr>
-              <w:t>Consolidated status tabs segregating reports across New, In Progress, Resolved, and Dismissed stages.</w:t>
+              <w:t>Comprehensive incident records table displaying violation categories, locations, and barangay assignments.</w:t>
             </w:r>
           </w:p>
         </w:tc>
@@ -19349,7 +18869,7 @@
                 <w:color w:val="0F172A"/>
                 <w:sz w:val="19"/>
               </w:rPr>
-              <w:t>Consolidated City-Wide Incident Records Table</w:t>
+              <w:t>Originating Barangay Jurisdiction Identification</w:t>
             </w:r>
           </w:p>
         </w:tc>
@@ -19374,7 +18894,7 @@
                 <w:color w:val="334155"/>
                 <w:sz w:val="18"/>
               </w:rPr>
-              <w:t>Comprehensive incident records table displaying violation categories, locations, and barangay assignments.</w:t>
+              <w:t>Originating barangay jurisdiction column indicating which local council has local primary authority.</w:t>
             </w:r>
           </w:p>
         </w:tc>
@@ -19429,7 +18949,7 @@
                 <w:color w:val="0F172A"/>
                 <w:sz w:val="19"/>
               </w:rPr>
-              <w:t>Executive Incident Oversight &amp; Status Update Action</w:t>
+              <w:t>Current Operational Resolution Status Badge</w:t>
             </w:r>
           </w:p>
         </w:tc>
@@ -19454,7 +18974,7 @@
                 <w:color w:val="334155"/>
                 <w:sz w:val="18"/>
               </w:rPr>
-              <w:t>Supervisory action button allowing City Hall to update report statuses or assign direct city escalations.</w:t>
+              <w:t>Real-time status badge tracking whether the barangay tanods or officials have addressed the issue.</w:t>
             </w:r>
           </w:p>
         </w:tc>
@@ -19601,7 +19121,7 @@
       <w:r>
         <w:drawing>
           <wp:inline xmlns:a="http://schemas.openxmlformats.org/drawingml/2006/main" xmlns:pic="http://schemas.openxmlformats.org/drawingml/2006/picture">
-            <wp:extent cx="5715000" cy="3571875"/>
+            <wp:extent cx="5715000" cy="3429000"/>
             <wp:docPr id="26" name="Picture 26"/>
             <wp:cNvGraphicFramePr>
               <a:graphicFrameLocks noChangeAspect="1"/>
@@ -19622,7 +19142,7 @@
                   <pic:spPr>
                     <a:xfrm>
                       <a:off x="0" y="0"/>
-                      <a:ext cx="5715000" cy="3571875"/>
+                      <a:ext cx="5715000" cy="3429000"/>
                     </a:xfrm>
                     <a:prstGeom prst="rect"/>
                   </pic:spPr>
@@ -19889,7 +19409,7 @@
                 <w:color w:val="0F172A"/>
                 <w:sz w:val="19"/>
               </w:rPr>
-              <w:t>Publish New Advisory Action Button ('Maglathala ng Anunsyo')</w:t>
+              <w:t>Publish New Advisory Action Button ('+ Magdagdag ng Anunsyo')</w:t>
             </w:r>
           </w:p>
         </w:tc>
@@ -19969,7 +19489,7 @@
                 <w:color w:val="0F172A"/>
                 <w:sz w:val="19"/>
               </w:rPr>
-              <w:t>Published Public News &amp; Emergency Advisories List</w:t>
+              <w:t>Published Public News &amp; Advisories Table</w:t>
             </w:r>
           </w:p>
         </w:tc>
@@ -19994,7 +19514,7 @@
                 <w:color w:val="334155"/>
                 <w:sz w:val="18"/>
               </w:rPr>
-              <w:t>Active public advisories stream displaying published executive notices, reminders, and press releases.</w:t>
+              <w:t>Published public advisories table displaying active executive notices, reminders, and press releases.</w:t>
             </w:r>
           </w:p>
         </w:tc>
@@ -20049,7 +19569,7 @@
                 <w:color w:val="0F172A"/>
                 <w:sz w:val="19"/>
               </w:rPr>
-              <w:t>Priority Pinning Toggle for Urgent Civic Directives</w:t>
+              <w:t>Advisory Management Controls (Edit, Delete, Sync to Public Feed)</w:t>
             </w:r>
           </w:p>
         </w:tc>
@@ -20057,86 +19577,6 @@
           <w:tcPr>
             <w:tcW w:type="dxa" w:w="5328"/>
             <w:shd w:fill="F8FAFC"/>
-            <w:tcMar>
-              <w:top w:w="80" w:type="dxa"/>
-              <w:bottom w:w="80" w:type="dxa"/>
-              <w:left w:w="120" w:type="dxa"/>
-              <w:right w:w="120" w:type="dxa"/>
-            </w:tcMar>
-          </w:tcPr>
-          <w:p>
-            <w:pPr>
-              <w:spacing w:before="0" w:after="0" w:line="276" w:lineRule="auto"/>
-            </w:pPr>
-            <w:r>
-              <w:rPr>
-                <w:rFonts w:ascii="Arial" w:hAnsi="Arial"/>
-                <w:color w:val="334155"/>
-                <w:sz w:val="18"/>
-              </w:rPr>
-              <w:t>Urgent priority pinning toggle highlighting critical public advisories at the top of the citizen portal.</w:t>
-            </w:r>
-          </w:p>
-        </w:tc>
-      </w:tr>
-      <w:tr>
-        <w:tc>
-          <w:tcPr>
-            <w:tcW w:type="dxa" w:w="864"/>
-            <w:shd w:fill="FFFFFF"/>
-            <w:tcMar>
-              <w:top w:w="80" w:type="dxa"/>
-              <w:bottom w:w="80" w:type="dxa"/>
-              <w:left w:w="120" w:type="dxa"/>
-              <w:right w:w="120" w:type="dxa"/>
-            </w:tcMar>
-          </w:tcPr>
-          <w:p>
-            <w:pPr>
-              <w:spacing w:before="0" w:after="0"/>
-              <w:jc w:val="center"/>
-            </w:pPr>
-            <w:r>
-              <w:rPr>
-                <w:rFonts w:ascii="Arial" w:hAnsi="Arial"/>
-                <w:b/>
-                <w:color w:val="047857"/>
-                <w:sz w:val="19"/>
-              </w:rPr>
-              <w:t>5</w:t>
-            </w:r>
-          </w:p>
-        </w:tc>
-        <w:tc>
-          <w:tcPr>
-            <w:tcW w:type="dxa" w:w="3168"/>
-            <w:shd w:fill="FFFFFF"/>
-            <w:tcMar>
-              <w:top w:w="80" w:type="dxa"/>
-              <w:bottom w:w="80" w:type="dxa"/>
-              <w:left w:w="120" w:type="dxa"/>
-              <w:right w:w="120" w:type="dxa"/>
-            </w:tcMar>
-          </w:tcPr>
-          <w:p>
-            <w:pPr>
-              <w:spacing w:before="0" w:after="0"/>
-            </w:pPr>
-            <w:r>
-              <w:rPr>
-                <w:rFonts w:ascii="Arial" w:hAnsi="Arial"/>
-                <w:b/>
-                <w:color w:val="0F172A"/>
-                <w:sz w:val="19"/>
-              </w:rPr>
-              <w:t>Advisory Management Controls (Edit, Delete, Sync to Public Feed)</w:t>
-            </w:r>
-          </w:p>
-        </w:tc>
-        <w:tc>
-          <w:tcPr>
-            <w:tcW w:type="dxa" w:w="5328"/>
-            <w:shd w:fill="FFFFFF"/>
             <w:tcMar>
               <w:top w:w="80" w:type="dxa"/>
               <w:bottom w:w="80" w:type="dxa"/>
@@ -20324,7 +19764,7 @@
       <w:r>
         <w:drawing>
           <wp:inline xmlns:a="http://schemas.openxmlformats.org/drawingml/2006/main" xmlns:pic="http://schemas.openxmlformats.org/drawingml/2006/picture">
-            <wp:extent cx="5715000" cy="3571875"/>
+            <wp:extent cx="5715000" cy="3429000"/>
             <wp:docPr id="27" name="Picture 27"/>
             <wp:cNvGraphicFramePr>
               <a:graphicFrameLocks noChangeAspect="1"/>
@@ -20345,7 +19785,7 @@
                   <pic:spPr>
                     <a:xfrm>
                       <a:off x="0" y="0"/>
-                      <a:ext cx="5715000" cy="3571875"/>
+                      <a:ext cx="5715000" cy="3429000"/>
                     </a:xfrm>
                     <a:prstGeom prst="rect"/>
                   </pic:spPr>
@@ -20532,7 +19972,7 @@
                 <w:color w:val="0F172A"/>
                 <w:sz w:val="19"/>
               </w:rPr>
-              <w:t>Legislative Report Structure Selector (All, by Month, Barangay, Category, Status)</w:t>
+              <w:t>Legislative Report Structure Selector Card (8 Standardized Structures)</w:t>
             </w:r>
           </w:p>
         </w:tc>
@@ -20612,7 +20052,7 @@
                 <w:color w:val="0F172A"/>
                 <w:sz w:val="19"/>
               </w:rPr>
-              <w:t>Multi-Criteria Filter Parameters (Year, Status, Category, Origin)</w:t>
+              <w:t>Multi-Criteria Filter Parameters Panel (Year, Status, Category, Origin)</w:t>
             </w:r>
           </w:p>
         </w:tc>
@@ -20772,7 +20212,7 @@
                 <w:color w:val="0F172A"/>
                 <w:sz w:val="19"/>
               </w:rPr>
-              <w:t>Official Government Header Preview with Cabanatuan City Seal</w:t>
+              <w:t>Export Formal PDF Document Action Button ('I-download bilang PDF')</w:t>
             </w:r>
           </w:p>
         </w:tc>
@@ -20780,86 +20220,6 @@
           <w:tcPr>
             <w:tcW w:type="dxa" w:w="5328"/>
             <w:shd w:fill="F8FAFC"/>
-            <w:tcMar>
-              <w:top w:w="80" w:type="dxa"/>
-              <w:bottom w:w="80" w:type="dxa"/>
-              <w:left w:w="120" w:type="dxa"/>
-              <w:right w:w="120" w:type="dxa"/>
-            </w:tcMar>
-          </w:tcPr>
-          <w:p>
-            <w:pPr>
-              <w:spacing w:before="0" w:after="0" w:line="276" w:lineRule="auto"/>
-            </w:pPr>
-            <w:r>
-              <w:rPr>
-                <w:rFonts w:ascii="Arial" w:hAnsi="Arial"/>
-                <w:color w:val="334155"/>
-                <w:sz w:val="18"/>
-              </w:rPr>
-              <w:t>Official document preview complete with the Republic of the Philippines header and Cabanatuan seal.</w:t>
-            </w:r>
-          </w:p>
-        </w:tc>
-      </w:tr>
-      <w:tr>
-        <w:tc>
-          <w:tcPr>
-            <w:tcW w:type="dxa" w:w="864"/>
-            <w:shd w:fill="FFFFFF"/>
-            <w:tcMar>
-              <w:top w:w="80" w:type="dxa"/>
-              <w:bottom w:w="80" w:type="dxa"/>
-              <w:left w:w="120" w:type="dxa"/>
-              <w:right w:w="120" w:type="dxa"/>
-            </w:tcMar>
-          </w:tcPr>
-          <w:p>
-            <w:pPr>
-              <w:spacing w:before="0" w:after="0"/>
-              <w:jc w:val="center"/>
-            </w:pPr>
-            <w:r>
-              <w:rPr>
-                <w:rFonts w:ascii="Arial" w:hAnsi="Arial"/>
-                <w:b/>
-                <w:color w:val="047857"/>
-                <w:sz w:val="19"/>
-              </w:rPr>
-              <w:t>5</w:t>
-            </w:r>
-          </w:p>
-        </w:tc>
-        <w:tc>
-          <w:tcPr>
-            <w:tcW w:type="dxa" w:w="3168"/>
-            <w:shd w:fill="FFFFFF"/>
-            <w:tcMar>
-              <w:top w:w="80" w:type="dxa"/>
-              <w:bottom w:w="80" w:type="dxa"/>
-              <w:left w:w="120" w:type="dxa"/>
-              <w:right w:w="120" w:type="dxa"/>
-            </w:tcMar>
-          </w:tcPr>
-          <w:p>
-            <w:pPr>
-              <w:spacing w:before="0" w:after="0"/>
-            </w:pPr>
-            <w:r>
-              <w:rPr>
-                <w:rFonts w:ascii="Arial" w:hAnsi="Arial"/>
-                <w:b/>
-                <w:color w:val="0F172A"/>
-                <w:sz w:val="19"/>
-              </w:rPr>
-              <w:t>Export Formal PDF Document Action Button ('I-download bilang PDF')</w:t>
-            </w:r>
-          </w:p>
-        </w:tc>
-        <w:tc>
-          <w:tcPr>
-            <w:tcW w:type="dxa" w:w="5328"/>
-            <w:shd w:fill="FFFFFF"/>
             <w:tcMar>
               <w:top w:w="80" w:type="dxa"/>
               <w:bottom w:w="80" w:type="dxa"/>
@@ -21024,7 +20384,7 @@
       <w:r>
         <w:drawing>
           <wp:inline xmlns:a="http://schemas.openxmlformats.org/drawingml/2006/main" xmlns:pic="http://schemas.openxmlformats.org/drawingml/2006/picture">
-            <wp:extent cx="5715000" cy="3571875"/>
+            <wp:extent cx="5715000" cy="3429000"/>
             <wp:docPr id="28" name="Picture 28"/>
             <wp:cNvGraphicFramePr>
               <a:graphicFrameLocks noChangeAspect="1"/>
@@ -21045,7 +20405,7 @@
                   <pic:spPr>
                     <a:xfrm>
                       <a:off x="0" y="0"/>
-                      <a:ext cx="5715000" cy="3571875"/>
+                      <a:ext cx="5715000" cy="3429000"/>
                     </a:xfrm>
                     <a:prstGeom prst="rect"/>
                   </pic:spPr>
@@ -21232,7 +20592,7 @@
                 <w:color w:val="0F172A"/>
                 <w:sz w:val="19"/>
               </w:rPr>
-              <w:t>Governance Analytics &amp; Policy Intelligence Header</w:t>
+              <w:t>Governance Analytics &amp; Policy Intelligence Header Card</w:t>
             </w:r>
           </w:p>
         </w:tc>
@@ -21312,7 +20672,7 @@
                 <w:color w:val="0F172A"/>
                 <w:sz w:val="19"/>
               </w:rPr>
-              <w:t>Legislative Enactment Velocity Trend Chart (Yearly Trajectory)</w:t>
+              <w:t>Legislative Year Filter Dropdown Selector</w:t>
             </w:r>
           </w:p>
         </w:tc>
@@ -21337,7 +20697,7 @@
                 <w:color w:val="334155"/>
                 <w:sz w:val="18"/>
               </w:rPr>
-              <w:t>Interactive legislative enactment velocity line chart tracking annual policy adoption trends.</w:t>
+              <w:t>Legislative year filter dropdown enabling dynamic scoping across calendar years or entire history.</w:t>
             </w:r>
           </w:p>
         </w:tc>
@@ -21392,7 +20752,7 @@
                 <w:color w:val="0F172A"/>
                 <w:sz w:val="19"/>
               </w:rPr>
-              <w:t>Policy Category Distribution Breakdown Chart</w:t>
+              <w:t>Executive Key Performance Indicators (KPI) Summary Banner</w:t>
             </w:r>
           </w:p>
         </w:tc>
@@ -21417,7 +20777,7 @@
                 <w:color w:val="334155"/>
                 <w:sz w:val="18"/>
               </w:rPr>
-              <w:t>Policy category distribution chart illustrating legislative focus across health, safety, and environment.</w:t>
+              <w:t>Executive key performance indicator (KPI) metric banner showing total ordinances and resolution rate.</w:t>
             </w:r>
           </w:p>
         </w:tc>
@@ -21472,7 +20832,7 @@
                 <w:color w:val="0F172A"/>
                 <w:sz w:val="19"/>
               </w:rPr>
-              <w:t>Barangay Legislative Participation &amp; Enactment Ranking</w:t>
+              <w:t>Policy Category Distribution Breakdown Chart</w:t>
             </w:r>
           </w:p>
         </w:tc>
@@ -21497,7 +20857,7 @@
                 <w:color w:val="334155"/>
                 <w:sz w:val="18"/>
               </w:rPr>
-              <w:t>Barangay legislative participation ranking highlighting top contributing barangays across the city.</w:t>
+              <w:t>Policy category distribution chart illustrating legislative focus across health, safety, and environment.</w:t>
             </w:r>
           </w:p>
         </w:tc>
@@ -21552,7 +20912,7 @@
                 <w:color w:val="0F172A"/>
                 <w:sz w:val="19"/>
               </w:rPr>
-              <w:t>Citizen Report Resolution Rate &amp; Efficiency Metrics</w:t>
+              <w:t>Legislative Status Breakdown Distribution Chart</w:t>
             </w:r>
           </w:p>
         </w:tc>
@@ -21577,7 +20937,7 @@
                 <w:color w:val="334155"/>
                 <w:sz w:val="18"/>
               </w:rPr>
-              <w:t>Citizen report resolution performance metric tracking the average response and closure rate.</w:t>
+              <w:t>Legislative status proportion pie chart displaying approved, pending, draft, and rejected distribution.</w:t>
             </w:r>
           </w:p>
         </w:tc>

</xml_diff>